<commit_message>
aanpassingen user stories en backlog
</commit_message>
<xml_diff>
--- a/user stories project.docx
+++ b/user stories project.docx
@@ -3,27 +3,15 @@
 <w:document xmlns:wpc="http://schemas.microsoft.com/office/word/2010/wordprocessingCanvas" xmlns:cx="http://schemas.microsoft.com/office/drawing/2014/chartex" xmlns:cx1="http://schemas.microsoft.com/office/drawing/2015/9/8/chartex" xmlns:cx2="http://schemas.microsoft.com/office/drawing/2015/10/21/chartex" xmlns:cx3="http://schemas.microsoft.com/office/drawing/2016/5/9/chartex" xmlns:cx4="http://schemas.microsoft.com/office/drawing/2016/5/10/chartex" xmlns:cx5="http://schemas.microsoft.com/office/drawing/2016/5/11/chartex" xmlns:cx6="http://schemas.microsoft.com/office/drawing/2016/5/12/chartex" xmlns:cx7="http://schemas.microsoft.com/office/drawing/2016/5/13/chartex" xmlns:cx8="http://schemas.microsoft.com/office/drawing/2016/5/14/chartex" xmlns:mc="http://schemas.openxmlformats.org/markup-compatibility/2006" xmlns:aink="http://schemas.microsoft.com/office/drawing/2016/ink" xmlns:am3d="http://schemas.microsoft.com/office/drawing/2017/model3d" xmlns:o="urn:schemas-microsoft-com:office:office" xmlns:oel="http://schemas.microsoft.com/office/2019/extlst" xmlns:r="http://schemas.openxmlformats.org/officeDocument/2006/relationships" xmlns:m="http://schemas.openxmlformats.org/officeDocument/2006/math" xmlns:v="urn:schemas-microsoft-com:vml" xmlns:wp14="http://schemas.microsoft.com/office/word/2010/wordprocessingDrawing" xmlns:wp="http://schemas.openxmlformats.org/drawingml/2006/wordprocessingDrawing" xmlns:w10="urn:schemas-microsoft-com:office:word" xmlns:w="http://schemas.openxmlformats.org/wordprocessingml/2006/main" xmlns:w14="http://schemas.microsoft.com/office/word/2010/wordml" xmlns:w15="http://schemas.microsoft.com/office/word/2012/wordml" xmlns:w16cex="http://schemas.microsoft.com/office/word/2018/wordml/cex" xmlns:w16cid="http://schemas.microsoft.com/office/word/2016/wordml/cid" xmlns:w16="http://schemas.microsoft.com/office/word/2018/wordml" xmlns:w16du="http://schemas.microsoft.com/office/word/2023/wordml/word16du" xmlns:w16sdtdh="http://schemas.microsoft.com/office/word/2020/wordml/sdtdatahash" xmlns:w16sdtfl="http://schemas.microsoft.com/office/word/2024/wordml/sdtformatlock" xmlns:w16se="http://schemas.microsoft.com/office/word/2015/wordml/symex" xmlns:wpg="http://schemas.microsoft.com/office/word/2010/wordprocessingGroup" xmlns:wpi="http://schemas.microsoft.com/office/word/2010/wordprocessingInk" xmlns:wne="http://schemas.microsoft.com/office/word/2006/wordml" xmlns:wps="http://schemas.microsoft.com/office/word/2010/wordprocessingShape" mc:Ignorable="w14 w15 w16se w16cid w16 w16cex w16sdtdh w16sdtfl w16du wp14">
   <w:body>
     <w:p>
-      <w:pPr>
-        <w:rPr>
-          <w:lang w:val="fr-BE"/>
-        </w:rPr>
-      </w:pPr>
       <w:r>
         <w:rPr>
           <w:b/>
           <w:bCs/>
-          <w:lang w:val="fr-BE"/>
         </w:rPr>
         <w:t>1 :</w:t>
       </w:r>
     </w:p>
-    <w:p>
-      <w:pPr>
-        <w:rPr>
-          <w:lang w:val="fr-BE"/>
-        </w:rPr>
-      </w:pPr>
-    </w:p>
+    <w:p/>
     <w:p>
       <w:r>
         <w:t>Als een user</w:t>
@@ -96,16 +84,10 @@
         </w:numPr>
       </w:pPr>
       <w:r>
-        <w:t>When alle HTML elementen</w:t>
-      </w:r>
-      <w:r>
-        <w:t xml:space="preserve"> succesvol</w:t>
-      </w:r>
-      <w:r>
-        <w:t xml:space="preserve"> geladen zijn</w:t>
-      </w:r>
-      <w:r>
-        <w:t xml:space="preserve"> en de fetch url effectief </w:t>
+        <w:t xml:space="preserve">When </w:t>
+      </w:r>
+      <w:r>
+        <w:t xml:space="preserve">de fetch url effectief </w:t>
       </w:r>
       <w:r>
         <w:t>naar de categorie van historische locaties</w:t>
@@ -147,10 +129,7 @@
         <w:t xml:space="preserve">When </w:t>
       </w:r>
       <w:r>
-        <w:t>een HTML element niet goed geladen werd</w:t>
-      </w:r>
-      <w:r>
-        <w:t xml:space="preserve"> of de fetch url verwijst niet naar de historische locaties van Brussel</w:t>
+        <w:t>de fetch url verwijst niet naar de historische locaties van Brussel</w:t>
       </w:r>
     </w:p>
     <w:p>
@@ -202,16 +181,16 @@
         <w:t xml:space="preserve"> locaties in Brussel te filtreren</w:t>
       </w:r>
       <w:r>
-        <w:t xml:space="preserve"> (op type, locatie, etc…) en deze te sorteren</w:t>
-      </w:r>
-      <w:r>
-        <w:t xml:space="preserve"> en een specifieke locatie op te zoeken op basis van zijn naam</w:t>
+        <w:t xml:space="preserve"> (op type, locatie, etc…)</w:t>
       </w:r>
       <w:r>
         <w:t xml:space="preserve">, zodat ik </w:t>
       </w:r>
       <w:r>
-        <w:t xml:space="preserve">snel en efficiënt een bepaalde locatie kan vinden. </w:t>
+        <w:t>mijn lijst kan beperken tot de gemeente dat ik nodig heb.</w:t>
+      </w:r>
+      <w:r>
+        <w:t xml:space="preserve"> </w:t>
       </w:r>
     </w:p>
     <w:p/>
@@ -290,8 +269,34 @@
         </w:numPr>
       </w:pPr>
       <w:r>
+        <w:t>Then een bericht wordt getoond die de user waarschuwt dat er geen elementen bestaan die aan zijn filtreer voorwaarde voldoen</w:t>
+      </w:r>
+    </w:p>
+    <w:p>
+      <w:r>
+        <w:rPr>
+          <w:b/>
+          <w:bCs/>
+        </w:rPr>
         <w:lastRenderedPageBreak/>
-        <w:t>Then een bericht wordt getoond die de user waarschuwt dat er geen elementen bestaan die aan zijn filtreer voorwaarde voldoen</w:t>
+        <w:t>3:</w:t>
+      </w:r>
+    </w:p>
+    <w:p>
+      <w:r>
+        <w:t xml:space="preserve">Als een user die de website bezoekt, wil ik de mogelijkheid hebben om een specifieke locatie </w:t>
+      </w:r>
+      <w:r>
+        <w:t>op te zoeken, zodat ik op een snelle manier een locatie kan vinden.</w:t>
+      </w:r>
+    </w:p>
+    <w:p/>
+    <w:p>
+      <w:r>
+        <w:rPr>
+          <w:u w:val="single"/>
+        </w:rPr>
+        <w:t>Gherkin</w:t>
       </w:r>
     </w:p>
     <w:p>
@@ -303,10 +308,10 @@
         </w:numPr>
       </w:pPr>
       <w:r>
-        <w:t xml:space="preserve">Given: een user </w:t>
-      </w:r>
-      <w:r>
-        <w:t>typt in de zoekbalk om een specifieke locatie te vinden</w:t>
+        <w:t xml:space="preserve">Given: een user klikt op de button om </w:t>
+      </w:r>
+      <w:r>
+        <w:t>een seach te doen</w:t>
       </w:r>
     </w:p>
     <w:p>
@@ -318,19 +323,7 @@
         </w:numPr>
       </w:pPr>
       <w:r>
-        <w:t xml:space="preserve">When de user </w:t>
-      </w:r>
-      <w:r>
-        <w:t>letters typt</w:t>
-      </w:r>
-      <w:r>
-        <w:t xml:space="preserve"> </w:t>
-      </w:r>
-      <w:r>
-        <w:t xml:space="preserve">waarvan </w:t>
-      </w:r>
-      <w:r>
-        <w:t>bepaalde elementen corresponderen aan wat hij typt</w:t>
+        <w:t>When de user een letter invoert</w:t>
       </w:r>
     </w:p>
     <w:p>
@@ -342,13 +335,10 @@
         </w:numPr>
       </w:pPr>
       <w:r>
-        <w:t>Then wordt de lijst aange</w:t>
-      </w:r>
-      <w:r>
-        <w:t xml:space="preserve">past elke keer hij een letter intypt </w:t>
-      </w:r>
-      <w:r>
-        <w:t>met alle elementen die tot nu toe corresponderen aan wat de user typt</w:t>
+        <w:t xml:space="preserve">Then wordt de hele lijst aangepast, letter per letter, om </w:t>
+      </w:r>
+      <w:r>
+        <w:t>alle elementen te tonen die, op basis van naam, corresponderen met wat de user typt.</w:t>
       </w:r>
     </w:p>
     <w:p>
@@ -360,16 +350,7 @@
         </w:numPr>
       </w:pPr>
       <w:r>
-        <w:t xml:space="preserve">When de user letters typt </w:t>
-      </w:r>
-      <w:r>
-        <w:t xml:space="preserve">waarvan </w:t>
-      </w:r>
-      <w:r>
-        <w:t>geen enkele</w:t>
-      </w:r>
-      <w:r>
-        <w:t xml:space="preserve"> elementen corresponderen aan wat hij typt</w:t>
+        <w:t>When de user niets invoert</w:t>
       </w:r>
     </w:p>
     <w:p>
@@ -381,22 +362,128 @@
         </w:numPr>
       </w:pPr>
       <w:r>
-        <w:t xml:space="preserve">Then </w:t>
-      </w:r>
-      <w:r>
-        <w:t xml:space="preserve">wordt een </w:t>
-      </w:r>
-      <w:r>
-        <w:t>tekst</w:t>
-      </w:r>
-      <w:r>
-        <w:t xml:space="preserve"> getoond om hem </w:t>
-      </w:r>
-      <w:r>
-        <w:t>te waarschuwen dat geen elementen overeen komen aan wat hij opzoekt</w:t>
+        <w:t>Then krijgt hij alle mogelijke locaties</w:t>
+      </w:r>
+    </w:p>
+    <w:p>
+      <w:pPr>
+        <w:pStyle w:val="ListParagraph"/>
+        <w:numPr>
+          <w:ilvl w:val="1"/>
+          <w:numId w:val="1"/>
+        </w:numPr>
+      </w:pPr>
+      <w:r>
+        <w:t>When de user iets invoert dat niet bestaat</w:t>
+      </w:r>
+    </w:p>
+    <w:p>
+      <w:pPr>
+        <w:pStyle w:val="ListParagraph"/>
+        <w:numPr>
+          <w:ilvl w:val="2"/>
+          <w:numId w:val="1"/>
+        </w:numPr>
+      </w:pPr>
+      <w:r>
+        <w:t>Then krijgt hij een foutmelding</w:t>
+      </w:r>
+    </w:p>
+    <w:p>
+      <w:r>
+        <w:rPr>
+          <w:b/>
+          <w:bCs/>
+        </w:rPr>
+        <w:t>4:</w:t>
+      </w:r>
+    </w:p>
+    <w:p>
+      <w:r>
+        <w:t>Als een user die de website bezoekt, wil ik de mogelijkheid hebben om de lijst op de homepage te sorteren</w:t>
+      </w:r>
+      <w:r>
+        <w:t>, zodat ik de locaties kan zien in de volgorde dat ik wil.</w:t>
       </w:r>
     </w:p>
     <w:p/>
+    <w:p>
+      <w:r>
+        <w:rPr>
+          <w:u w:val="single"/>
+        </w:rPr>
+        <w:t>Gherkin</w:t>
+      </w:r>
+      <w:r>
+        <w:t>:</w:t>
+      </w:r>
+    </w:p>
+    <w:p>
+      <w:pPr>
+        <w:pStyle w:val="ListParagraph"/>
+        <w:numPr>
+          <w:ilvl w:val="0"/>
+          <w:numId w:val="1"/>
+        </w:numPr>
+      </w:pPr>
+      <w:r>
+        <w:t>Given: een user kiest een bepaalde</w:t>
+      </w:r>
+      <w:r>
+        <w:t xml:space="preserve"> sorteermethode</w:t>
+      </w:r>
+    </w:p>
+    <w:p>
+      <w:pPr>
+        <w:pStyle w:val="ListParagraph"/>
+        <w:numPr>
+          <w:ilvl w:val="1"/>
+          <w:numId w:val="1"/>
+        </w:numPr>
+      </w:pPr>
+      <w:r>
+        <w:t>When deze sorteermethode kan toegepast worden op de huidige lijst</w:t>
+      </w:r>
+    </w:p>
+    <w:p>
+      <w:pPr>
+        <w:pStyle w:val="ListParagraph"/>
+        <w:numPr>
+          <w:ilvl w:val="2"/>
+          <w:numId w:val="1"/>
+        </w:numPr>
+      </w:pPr>
+      <w:r>
+        <w:t>Then wordt de huidige lijst aangepast en gesorteerd volgens zijn keuze</w:t>
+      </w:r>
+    </w:p>
+    <w:p>
+      <w:pPr>
+        <w:pStyle w:val="ListParagraph"/>
+        <w:numPr>
+          <w:ilvl w:val="1"/>
+          <w:numId w:val="1"/>
+        </w:numPr>
+      </w:pPr>
+      <w:r>
+        <w:t>When deze sorteermethode niet toe</w:t>
+      </w:r>
+      <w:r>
+        <w:t>gepast kan worden op de lijst</w:t>
+      </w:r>
+    </w:p>
+    <w:p>
+      <w:pPr>
+        <w:pStyle w:val="ListParagraph"/>
+        <w:numPr>
+          <w:ilvl w:val="2"/>
+          <w:numId w:val="1"/>
+        </w:numPr>
+      </w:pPr>
+      <w:r>
+        <w:t>Then krijgt hij een foutmelding</w:t>
+      </w:r>
+    </w:p>
     <w:p>
       <w:r>
         <w:rPr>
@@ -484,6 +571,7 @@
         </w:numPr>
       </w:pPr>
       <w:r>
+        <w:lastRenderedPageBreak/>
         <w:t>When deze locaties of gebruikersvoorkeuren niet bestaan in zijn op te slagen elementen</w:t>
       </w:r>
     </w:p>
@@ -568,7 +656,6 @@
         </w:numPr>
       </w:pPr>
       <w:r>
-        <w:lastRenderedPageBreak/>
         <w:t xml:space="preserve">Given: </w:t>
       </w:r>
       <w:r>
@@ -641,7 +728,7 @@
   <w:abstractNum w:abstractNumId="0" w15:restartNumberingAfterBreak="0">
     <w:nsid w:val="0D4D083D"/>
     <w:multiLevelType w:val="hybridMultilevel"/>
-    <w:tmpl w:val="C8D08C8A"/>
+    <w:tmpl w:val="E834C53E"/>
     <w:lvl w:ilvl="0" w:tplc="08130001">
       <w:start w:val="1"/>
       <w:numFmt w:val="bullet"/>

</xml_diff>

<commit_message>
aanpassingen user story en backlog aangepast + kleine fout in js aangepast
</commit_message>
<xml_diff>
--- a/user stories project.docx
+++ b/user stories project.docx
@@ -490,7 +490,14 @@
           <w:b/>
           <w:bCs/>
         </w:rPr>
-        <w:t>3:</w:t>
+        <w:t>5</w:t>
+      </w:r>
+      <w:r>
+        <w:rPr>
+          <w:b/>
+          <w:bCs/>
+        </w:rPr>
+        <w:t>:</w:t>
       </w:r>
     </w:p>
     <w:p/>
@@ -499,40 +506,13 @@
         <w:t>Als een user die de website bezoekt, wil ik</w:t>
       </w:r>
       <w:r>
-        <w:t xml:space="preserve"> mijn gebruikersvoorkeuren en </w:t>
-      </w:r>
-      <w:r>
-        <w:t>bepaalde locaties</w:t>
-      </w:r>
-      <w:r>
-        <w:t xml:space="preserve"> kunnen</w:t>
-      </w:r>
-      <w:r>
-        <w:t xml:space="preserve"> opslaan</w:t>
-      </w:r>
-      <w:r>
-        <w:t xml:space="preserve">, </w:t>
-      </w:r>
-      <w:r>
-        <w:t xml:space="preserve">waarbij deze favoriete collecties </w:t>
-      </w:r>
-      <w:r>
-        <w:t xml:space="preserve">en gebruikersvoorkeuren </w:t>
-      </w:r>
-      <w:r>
-        <w:t>word</w:t>
-      </w:r>
-      <w:r>
-        <w:t>en</w:t>
-      </w:r>
-      <w:r>
-        <w:t xml:space="preserve"> bewaard</w:t>
-      </w:r>
-      <w:r>
-        <w:t xml:space="preserve"> tussen verschillende sessies</w:t>
-      </w:r>
-      <w:r>
-        <w:t>.</w:t>
+        <w:t xml:space="preserve"> </w:t>
+      </w:r>
+      <w:r>
+        <w:t xml:space="preserve">bepaalde locaties als favoriet kunnen opslaan, waarbij </w:t>
+      </w:r>
+      <w:r>
+        <w:t>deze locaties wordt bijgehouden tussen mijn sessies, zodat ik snel mijn locaties kan terug vinden.</w:t>
       </w:r>
     </w:p>
     <w:p/>
@@ -559,7 +539,7 @@
         <w:t xml:space="preserve">een user wilt </w:t>
       </w:r>
       <w:r>
-        <w:t>locaties en gebruikersvoorkeuren opslaan tussen verschillende sessies</w:t>
+        <w:t>een locatie als favoriet toevoegen</w:t>
       </w:r>
     </w:p>
     <w:p>
@@ -572,7 +552,13 @@
       </w:pPr>
       <w:r>
         <w:lastRenderedPageBreak/>
-        <w:t>When deze locaties of gebruikersvoorkeuren niet bestaan in zijn op te slagen elementen</w:t>
+        <w:t xml:space="preserve">When </w:t>
+      </w:r>
+      <w:r>
+        <w:t xml:space="preserve">deze locatie niet bestaat in de collectie </w:t>
+      </w:r>
+      <w:r>
+        <w:t>van favorieten van deze persoon niet bestaat</w:t>
       </w:r>
     </w:p>
     <w:p>
@@ -584,7 +570,16 @@
         </w:numPr>
       </w:pPr>
       <w:r>
-        <w:t>Then deze elementen worden opgeslaan</w:t>
+        <w:t xml:space="preserve">Then deze </w:t>
+      </w:r>
+      <w:r>
+        <w:t>locatie</w:t>
+      </w:r>
+      <w:r>
+        <w:t xml:space="preserve"> </w:t>
+      </w:r>
+      <w:r>
+        <w:t>wordt als favoriet opgeslagen</w:t>
       </w:r>
     </w:p>
     <w:p>
@@ -596,7 +591,22 @@
         </w:numPr>
       </w:pPr>
       <w:r>
-        <w:t>When deze locaties of gebruikersvoorkeuren al bestaan in zijn op te slagen elementen</w:t>
+        <w:t xml:space="preserve">When deze </w:t>
+      </w:r>
+      <w:r>
+        <w:t xml:space="preserve">locatie </w:t>
+      </w:r>
+      <w:r>
+        <w:t>al bestaa</w:t>
+      </w:r>
+      <w:r>
+        <w:t>t</w:t>
+      </w:r>
+      <w:r>
+        <w:t xml:space="preserve"> in zijn </w:t>
+      </w:r>
+      <w:r>
+        <w:t>collectie</w:t>
       </w:r>
     </w:p>
     <w:p>
@@ -614,14 +624,91 @@
         <w:t>krijgt hij een bericht dat deze elementen al bestaan in zijn collectie</w:t>
       </w:r>
     </w:p>
-    <w:p/>
     <w:p>
       <w:r>
         <w:rPr>
           <w:b/>
           <w:bCs/>
         </w:rPr>
-        <w:t>4:</w:t>
+        <w:t>6:</w:t>
+      </w:r>
+    </w:p>
+    <w:p/>
+    <w:p>
+      <w:r>
+        <w:t>Als een user die de website bezoekt, wil ik de mogelijkheid om bepaalde voorkeuren (bijvoorbeeld: mijn taal) te veranderen en die op te slagen doorheen verschillende sessies.</w:t>
+      </w:r>
+    </w:p>
+    <w:p/>
+    <w:p>
+      <w:pPr>
+        <w:pStyle w:val="ListParagraph"/>
+        <w:numPr>
+          <w:ilvl w:val="0"/>
+          <w:numId w:val="2"/>
+        </w:numPr>
+      </w:pPr>
+      <w:r>
+        <w:t>Given: een user veranderd een persoonlijke voorkeur</w:t>
+      </w:r>
+    </w:p>
+    <w:p>
+      <w:pPr>
+        <w:pStyle w:val="ListParagraph"/>
+        <w:numPr>
+          <w:ilvl w:val="1"/>
+          <w:numId w:val="2"/>
+        </w:numPr>
+      </w:pPr>
+      <w:r>
+        <w:t>When</w:t>
+      </w:r>
+      <w:r>
+        <w:t xml:space="preserve"> de user een voorkeur kie</w:t>
+      </w:r>
+      <w:r>
+        <w:t>st</w:t>
+      </w:r>
+    </w:p>
+    <w:p>
+      <w:pPr>
+        <w:pStyle w:val="ListParagraph"/>
+        <w:numPr>
+          <w:ilvl w:val="2"/>
+          <w:numId w:val="2"/>
+        </w:numPr>
+      </w:pPr>
+      <w:r>
+        <w:t xml:space="preserve">Then wordt het opgeslagen </w:t>
+      </w:r>
+    </w:p>
+    <w:p>
+      <w:pPr>
+        <w:pStyle w:val="ListParagraph"/>
+        <w:numPr>
+          <w:ilvl w:val="1"/>
+          <w:numId w:val="2"/>
+        </w:numPr>
+      </w:pPr>
+      <w:r>
+        <w:t>….</w:t>
+      </w:r>
+    </w:p>
+    <w:p/>
+    <w:p>
+      <w:r>
+        <w:rPr>
+          <w:b/>
+          <w:bCs/>
+        </w:rPr>
+        <w:t>7</w:t>
+      </w:r>
+      <w:r>
+        <w:rPr>
+          <w:b/>
+          <w:bCs/>
+        </w:rPr>
+        <w:t>:</w:t>
       </w:r>
     </w:p>
     <w:p>
@@ -711,6 +798,38 @@
       </w:pPr>
       <w:r>
         <w:t>Then de layout wordt gespreid over de lengte van de scherm (elementen zetten zich onder elkaar)</w:t>
+      </w:r>
+    </w:p>
+    <w:p/>
+    <w:p>
+      <w:r>
+        <w:rPr>
+          <w:b/>
+          <w:bCs/>
+        </w:rPr>
+        <w:t>8:</w:t>
+      </w:r>
+    </w:p>
+    <w:p>
+      <w:r>
+        <w:lastRenderedPageBreak/>
+        <w:t>Als een user die de website bezoekt, wil ik een duidelijke een aantrekkelijke UI, waarvan de button duidelijk aantonen wat hun functies zijn, zodat ik de website op een efficiënte manier kan gebruiken</w:t>
+      </w:r>
+      <w:r>
+        <w:t>.</w:t>
+      </w:r>
+    </w:p>
+    <w:p/>
+    <w:p>
+      <w:pPr>
+        <w:pStyle w:val="ListParagraph"/>
+        <w:numPr>
+          <w:ilvl w:val="0"/>
+          <w:numId w:val="2"/>
+        </w:numPr>
+      </w:pPr>
+      <w:r>
+        <w:t>Given</w:t>
       </w:r>
     </w:p>
     <w:sectPr>
@@ -841,7 +960,7 @@
   <w:abstractNum w:abstractNumId="1" w15:restartNumberingAfterBreak="0">
     <w:nsid w:val="6F8174CC"/>
     <w:multiLevelType w:val="hybridMultilevel"/>
-    <w:tmpl w:val="819A9354"/>
+    <w:tmpl w:val="45DEDB04"/>
     <w:lvl w:ilvl="0" w:tplc="08130001">
       <w:start w:val="1"/>
       <w:numFmt w:val="bullet"/>

</xml_diff>

<commit_message>
backlog en user stories bijna klaar
</commit_message>
<xml_diff>
--- a/user stories project.docx
+++ b/user stories project.docx
@@ -3,13 +3,21 @@
 <w:document xmlns:wpc="http://schemas.microsoft.com/office/word/2010/wordprocessingCanvas" xmlns:cx="http://schemas.microsoft.com/office/drawing/2014/chartex" xmlns:cx1="http://schemas.microsoft.com/office/drawing/2015/9/8/chartex" xmlns:cx2="http://schemas.microsoft.com/office/drawing/2015/10/21/chartex" xmlns:cx3="http://schemas.microsoft.com/office/drawing/2016/5/9/chartex" xmlns:cx4="http://schemas.microsoft.com/office/drawing/2016/5/10/chartex" xmlns:cx5="http://schemas.microsoft.com/office/drawing/2016/5/11/chartex" xmlns:cx6="http://schemas.microsoft.com/office/drawing/2016/5/12/chartex" xmlns:cx7="http://schemas.microsoft.com/office/drawing/2016/5/13/chartex" xmlns:cx8="http://schemas.microsoft.com/office/drawing/2016/5/14/chartex" xmlns:mc="http://schemas.openxmlformats.org/markup-compatibility/2006" xmlns:aink="http://schemas.microsoft.com/office/drawing/2016/ink" xmlns:am3d="http://schemas.microsoft.com/office/drawing/2017/model3d" xmlns:o="urn:schemas-microsoft-com:office:office" xmlns:oel="http://schemas.microsoft.com/office/2019/extlst" xmlns:r="http://schemas.openxmlformats.org/officeDocument/2006/relationships" xmlns:m="http://schemas.openxmlformats.org/officeDocument/2006/math" xmlns:v="urn:schemas-microsoft-com:vml" xmlns:wp14="http://schemas.microsoft.com/office/word/2010/wordprocessingDrawing" xmlns:wp="http://schemas.openxmlformats.org/drawingml/2006/wordprocessingDrawing" xmlns:w10="urn:schemas-microsoft-com:office:word" xmlns:w="http://schemas.openxmlformats.org/wordprocessingml/2006/main" xmlns:w14="http://schemas.microsoft.com/office/word/2010/wordml" xmlns:w15="http://schemas.microsoft.com/office/word/2012/wordml" xmlns:w16cex="http://schemas.microsoft.com/office/word/2018/wordml/cex" xmlns:w16cid="http://schemas.microsoft.com/office/word/2016/wordml/cid" xmlns:w16="http://schemas.microsoft.com/office/word/2018/wordml" xmlns:w16du="http://schemas.microsoft.com/office/word/2023/wordml/word16du" xmlns:w16sdtdh="http://schemas.microsoft.com/office/word/2020/wordml/sdtdatahash" xmlns:w16sdtfl="http://schemas.microsoft.com/office/word/2024/wordml/sdtformatlock" xmlns:w16se="http://schemas.microsoft.com/office/word/2015/wordml/symex" xmlns:wpg="http://schemas.microsoft.com/office/word/2010/wordprocessingGroup" xmlns:wpi="http://schemas.microsoft.com/office/word/2010/wordprocessingInk" xmlns:wne="http://schemas.microsoft.com/office/word/2006/wordml" xmlns:wps="http://schemas.microsoft.com/office/word/2010/wordprocessingShape" mc:Ignorable="w14 w15 w16se w16cid w16 w16cex w16sdtdh w16sdtfl w16du wp14">
   <w:body>
     <w:p>
-      <w:r>
+      <w:pPr>
         <w:rPr>
           <w:b/>
           <w:bCs/>
         </w:rPr>
+      </w:pPr>
+      <w:proofErr w:type="gramStart"/>
+      <w:r>
+        <w:rPr>
+          <w:b/>
+          <w:bCs/>
+        </w:rPr>
         <w:t>1 :</w:t>
       </w:r>
+      <w:proofErr w:type="gramEnd"/>
     </w:p>
     <w:p/>
     <w:p>
@@ -26,10 +34,7 @@
         <w:t xml:space="preserve">, </w:t>
       </w:r>
       <w:r>
-        <w:t>wil ik e</w:t>
-      </w:r>
-      <w:r>
-        <w:t xml:space="preserve">en lijst </w:t>
+        <w:t xml:space="preserve">wil ik een lijst </w:t>
       </w:r>
       <w:r>
         <w:t>van alle historische locaties in Brussel in een tabel met minimum 6 kolommen van informatie</w:t>
@@ -111,10 +116,30 @@
         <w:t xml:space="preserve">Then alle historische locaties worden opgelijst </w:t>
       </w:r>
       <w:r>
-        <w:t>op een aantrekkelijke manier met 6 kolommen van informatie</w:t>
-      </w:r>
-      <w:r>
-        <w:t xml:space="preserve"> / details</w:t>
+        <w:t xml:space="preserve">op een aantrekkelijke manier met 6 kolommen van </w:t>
+      </w:r>
+      <w:proofErr w:type="gramStart"/>
+      <w:r>
+        <w:t>informatie</w:t>
+      </w:r>
+      <w:r>
+        <w:t xml:space="preserve"> /</w:t>
+      </w:r>
+      <w:proofErr w:type="gramEnd"/>
+      <w:r>
+        <w:t xml:space="preserve"> details</w:t>
+      </w:r>
+    </w:p>
+    <w:p>
+      <w:pPr>
+        <w:pStyle w:val="ListParagraph"/>
+        <w:numPr>
+          <w:ilvl w:val="0"/>
+          <w:numId w:val="1"/>
+        </w:numPr>
+      </w:pPr>
+      <w:r>
+        <w:t>Given: een user opent de website</w:t>
       </w:r>
     </w:p>
     <w:p>
@@ -126,10 +151,7 @@
         </w:numPr>
       </w:pPr>
       <w:r>
-        <w:t xml:space="preserve">When </w:t>
-      </w:r>
-      <w:r>
-        <w:t>de fetch url verwijst niet naar de historische locaties van Brussel</w:t>
+        <w:t>When de data van historische locaties niet succesvol wordt opgehaald</w:t>
       </w:r>
     </w:p>
     <w:p>
@@ -141,696 +163,1220 @@
         </w:numPr>
       </w:pPr>
       <w:r>
-        <w:t>Then historische locaties word</w:t>
-      </w:r>
-      <w:r>
-        <w:t>en</w:t>
-      </w:r>
-      <w:r>
-        <w:t xml:space="preserve"> niet geladen</w:t>
-      </w:r>
-      <w:r>
-        <w:t xml:space="preserve"> en user moet site refreshen</w:t>
-      </w:r>
-    </w:p>
-    <w:p/>
-    <w:p>
-      <w:r>
+        <w:t>Then wordt een foutmelding getoond dat de locaties niet geladen konden worden</w:t>
+      </w:r>
+    </w:p>
+    <w:p>
+      <w:pPr>
+        <w:pStyle w:val="ListParagraph"/>
+        <w:numPr>
+          <w:ilvl w:val="0"/>
+          <w:numId w:val="1"/>
+        </w:numPr>
+      </w:pPr>
+      <w:r>
+        <w:t>Given een user opent de website</w:t>
+      </w:r>
+    </w:p>
+    <w:p>
+      <w:pPr>
+        <w:pStyle w:val="ListParagraph"/>
+        <w:numPr>
+          <w:ilvl w:val="1"/>
+          <w:numId w:val="1"/>
+        </w:numPr>
+      </w:pPr>
+      <w:r>
+        <w:t>When de historische locaties geladen zijn</w:t>
+      </w:r>
+    </w:p>
+    <w:p>
+      <w:pPr>
+        <w:pStyle w:val="ListParagraph"/>
+        <w:numPr>
+          <w:ilvl w:val="2"/>
+          <w:numId w:val="1"/>
+        </w:numPr>
+      </w:pPr>
+      <w:r>
+        <w:t>Then krijgt de user een duidelijke en leesbare weergave van de locaties</w:t>
+      </w:r>
+    </w:p>
+    <w:p>
+      <w:pPr>
         <w:rPr>
           <w:b/>
           <w:bCs/>
         </w:rPr>
-        <w:t>2:</w:t>
-      </w:r>
-      <w:r>
-        <w:t xml:space="preserve"> </w:t>
-      </w:r>
-    </w:p>
-    <w:p/>
-    <w:p>
-      <w:r>
-        <w:t>Als een user die de website bezoekt, wil ik de mogelijkheid hebben o</w:t>
-      </w:r>
-      <w:r>
-        <w:t xml:space="preserve">m de lijst van </w:t>
-      </w:r>
-      <w:r>
-        <w:t>historische</w:t>
-      </w:r>
-      <w:r>
-        <w:t xml:space="preserve"> locaties in Brussel te filtreren</w:t>
-      </w:r>
-      <w:r>
-        <w:t xml:space="preserve"> (op type, locatie, etc…)</w:t>
-      </w:r>
-      <w:r>
-        <w:t xml:space="preserve">, zodat ik </w:t>
-      </w:r>
-      <w:r>
-        <w:t>mijn lijst kan beperken tot de gemeente dat ik nodig heb.</w:t>
-      </w:r>
-      <w:r>
-        <w:t xml:space="preserve"> </w:t>
-      </w:r>
-    </w:p>
-    <w:p/>
-    <w:p>
-      <w:r>
-        <w:rPr>
-          <w:u w:val="single"/>
-        </w:rPr>
-        <w:t>Gherkin</w:t>
-      </w:r>
-    </w:p>
-    <w:p/>
-    <w:p>
-      <w:pPr>
-        <w:pStyle w:val="ListParagraph"/>
-        <w:numPr>
-          <w:ilvl w:val="0"/>
-          <w:numId w:val="1"/>
-        </w:numPr>
-      </w:pPr>
-      <w:r>
-        <w:t xml:space="preserve">Given: een user </w:t>
-      </w:r>
-      <w:r>
-        <w:t xml:space="preserve">selecteert </w:t>
-      </w:r>
-      <w:r>
-        <w:t>bepaalde filtreer opties</w:t>
-      </w:r>
-    </w:p>
-    <w:p>
-      <w:pPr>
-        <w:pStyle w:val="ListParagraph"/>
-        <w:numPr>
-          <w:ilvl w:val="1"/>
-          <w:numId w:val="1"/>
-        </w:numPr>
-      </w:pPr>
-      <w:r>
-        <w:t>When elementen bestaan die corresponderen aan de filtreer voorwaarde van de user</w:t>
-      </w:r>
-    </w:p>
-    <w:p>
-      <w:pPr>
-        <w:pStyle w:val="ListParagraph"/>
-        <w:numPr>
-          <w:ilvl w:val="2"/>
-          <w:numId w:val="1"/>
-        </w:numPr>
-      </w:pPr>
-      <w:r>
-        <w:t>Then de lijst van historische locaties verandert om zich aan te passen aan de filtreer voorwaarde van de user</w:t>
-      </w:r>
-    </w:p>
-    <w:p>
-      <w:pPr>
-        <w:pStyle w:val="ListParagraph"/>
-        <w:numPr>
-          <w:ilvl w:val="1"/>
-          <w:numId w:val="1"/>
-        </w:numPr>
-      </w:pPr>
-      <w:r>
-        <w:t xml:space="preserve">When </w:t>
-      </w:r>
-      <w:r>
-        <w:t>geen elementen bestaan die corresponderen aan de filtreer voorwaarde van de user</w:t>
-      </w:r>
-    </w:p>
-    <w:p>
-      <w:pPr>
-        <w:pStyle w:val="ListParagraph"/>
-        <w:numPr>
-          <w:ilvl w:val="2"/>
-          <w:numId w:val="1"/>
-        </w:numPr>
-      </w:pPr>
-      <w:r>
-        <w:t>Then een bericht wordt getoond die de user waarschuwt dat er geen elementen bestaan die aan zijn filtreer voorwaarde voldoen</w:t>
-      </w:r>
-    </w:p>
-    <w:p>
+      </w:pPr>
       <w:r>
         <w:rPr>
           <w:b/>
           <w:bCs/>
         </w:rPr>
+        <w:t xml:space="preserve">2: </w:t>
+      </w:r>
+    </w:p>
+    <w:p/>
+    <w:p>
+      <w:r>
+        <w:t>Als een user die de website bezoekt, wil ik de mogelijkheid hebben om de lijst van historische locaties in Brussel te filtreren (op type, locatie, etc.), zodat ik mijn lijst kan beperken tot de gemeente dat ik nodig heb.</w:t>
+      </w:r>
+    </w:p>
+    <w:p>
+      <w:r>
+        <w:rPr>
+          <w:u w:val="single"/>
+        </w:rPr>
+        <w:t>Gherkin</w:t>
+      </w:r>
+    </w:p>
+    <w:p/>
+    <w:p>
+      <w:pPr>
+        <w:pStyle w:val="ListParagraph"/>
+        <w:numPr>
+          <w:ilvl w:val="0"/>
+          <w:numId w:val="3"/>
+        </w:numPr>
+      </w:pPr>
+      <w:r>
+        <w:t>Given een user selecteert een of meerdere filteropties</w:t>
+      </w:r>
+    </w:p>
+    <w:p>
+      <w:pPr>
+        <w:pStyle w:val="ListParagraph"/>
+        <w:numPr>
+          <w:ilvl w:val="1"/>
+          <w:numId w:val="3"/>
+        </w:numPr>
+      </w:pPr>
+      <w:r>
+        <w:t>When er locaties bestaan die overeenkomen met de gekozen filtervoorwaarden</w:t>
+      </w:r>
+    </w:p>
+    <w:p>
+      <w:pPr>
+        <w:pStyle w:val="ListParagraph"/>
+        <w:numPr>
+          <w:ilvl w:val="2"/>
+          <w:numId w:val="3"/>
+        </w:numPr>
+      </w:pPr>
+      <w:r>
+        <w:t>Then wordt de lijst aangepast zodat enkel de overeenkomende locaties zichtbaar zijn</w:t>
+      </w:r>
+    </w:p>
+    <w:p>
+      <w:pPr>
+        <w:pStyle w:val="ListParagraph"/>
+        <w:numPr>
+          <w:ilvl w:val="0"/>
+          <w:numId w:val="3"/>
+        </w:numPr>
+      </w:pPr>
+      <w:r>
+        <w:t>Given een user selecteert een of meerdere filteropties</w:t>
+      </w:r>
+    </w:p>
+    <w:p>
+      <w:pPr>
+        <w:pStyle w:val="ListParagraph"/>
+        <w:numPr>
+          <w:ilvl w:val="1"/>
+          <w:numId w:val="3"/>
+        </w:numPr>
+      </w:pPr>
+      <w:r>
         <w:lastRenderedPageBreak/>
-        <w:t>3:</w:t>
-      </w:r>
-    </w:p>
-    <w:p>
-      <w:r>
-        <w:t xml:space="preserve">Als een user die de website bezoekt, wil ik de mogelijkheid hebben om een specifieke locatie </w:t>
-      </w:r>
-      <w:r>
-        <w:t>op te zoeken, zodat ik op een snelle manier een locatie kan vinden.</w:t>
-      </w:r>
-    </w:p>
-    <w:p/>
-    <w:p>
-      <w:r>
-        <w:rPr>
-          <w:u w:val="single"/>
-        </w:rPr>
-        <w:t>Gherkin</w:t>
-      </w:r>
-    </w:p>
-    <w:p>
-      <w:pPr>
-        <w:pStyle w:val="ListParagraph"/>
+        <w:t>When er geen locaties bestaan die overeenkomen met de gekozen filtervoorwaarden</w:t>
+      </w:r>
+    </w:p>
+    <w:p>
+      <w:pPr>
+        <w:pStyle w:val="ListParagraph"/>
+        <w:numPr>
+          <w:ilvl w:val="2"/>
+          <w:numId w:val="3"/>
+        </w:numPr>
+      </w:pPr>
+      <w:r>
+        <w:t>Then wordt een melding getoond dat er geen resultaten gevonden zijn</w:t>
+      </w:r>
+    </w:p>
+    <w:p>
+      <w:pPr>
         <w:numPr>
           <w:ilvl w:val="0"/>
-          <w:numId w:val="1"/>
-        </w:numPr>
-      </w:pPr>
-      <w:r>
-        <w:t xml:space="preserve">Given: een user klikt op de button om </w:t>
-      </w:r>
-      <w:r>
-        <w:t>een seach te doen</w:t>
-      </w:r>
-    </w:p>
-    <w:p>
-      <w:pPr>
-        <w:pStyle w:val="ListParagraph"/>
+          <w:numId w:val="3"/>
+        </w:numPr>
+        <w:spacing w:before="100" w:beforeAutospacing="1" w:after="100" w:afterAutospacing="1" w:line="240" w:lineRule="auto"/>
+        <w:rPr>
+          <w:rFonts w:eastAsia="Times New Roman" w:cs="Times New Roman"/>
+          <w:lang w:eastAsia="nl-BE"/>
+          <w14:ligatures w14:val="none"/>
+        </w:rPr>
+      </w:pPr>
+      <w:r>
+        <w:rPr>
+          <w:rFonts w:eastAsia="Times New Roman" w:cs="Times New Roman"/>
+          <w:lang w:eastAsia="nl-BE"/>
+          <w14:ligatures w14:val="none"/>
+        </w:rPr>
+        <w:t>Given een user heeft filters toegepast</w:t>
+      </w:r>
+    </w:p>
+    <w:p>
+      <w:pPr>
         <w:numPr>
           <w:ilvl w:val="1"/>
-          <w:numId w:val="1"/>
-        </w:numPr>
-      </w:pPr>
-      <w:r>
-        <w:t>When de user een letter invoert</w:t>
-      </w:r>
-    </w:p>
-    <w:p>
-      <w:pPr>
-        <w:pStyle w:val="ListParagraph"/>
+          <w:numId w:val="3"/>
+        </w:numPr>
+        <w:spacing w:before="100" w:beforeAutospacing="1" w:after="100" w:afterAutospacing="1" w:line="240" w:lineRule="auto"/>
+        <w:rPr>
+          <w:rFonts w:eastAsia="Times New Roman" w:cs="Times New Roman"/>
+          <w:lang w:eastAsia="nl-BE"/>
+          <w14:ligatures w14:val="none"/>
+        </w:rPr>
+      </w:pPr>
+      <w:r>
+        <w:rPr>
+          <w:rFonts w:eastAsia="Times New Roman" w:cs="Times New Roman"/>
+          <w:lang w:eastAsia="nl-BE"/>
+          <w14:ligatures w14:val="none"/>
+        </w:rPr>
+        <w:t>When de user de filters verwijdert of reset</w:t>
+      </w:r>
+    </w:p>
+    <w:p>
+      <w:pPr>
         <w:numPr>
           <w:ilvl w:val="2"/>
-          <w:numId w:val="1"/>
-        </w:numPr>
-      </w:pPr>
-      <w:r>
-        <w:t xml:space="preserve">Then wordt de hele lijst aangepast, letter per letter, om </w:t>
-      </w:r>
-      <w:r>
-        <w:t>alle elementen te tonen die, op basis van naam, corresponderen met wat de user typt.</w:t>
-      </w:r>
-    </w:p>
-    <w:p>
-      <w:pPr>
-        <w:pStyle w:val="ListParagraph"/>
-        <w:numPr>
-          <w:ilvl w:val="1"/>
-          <w:numId w:val="1"/>
-        </w:numPr>
-      </w:pPr>
-      <w:r>
-        <w:t>When de user niets invoert</w:t>
-      </w:r>
-    </w:p>
-    <w:p>
-      <w:pPr>
-        <w:pStyle w:val="ListParagraph"/>
-        <w:numPr>
-          <w:ilvl w:val="2"/>
-          <w:numId w:val="1"/>
-        </w:numPr>
-      </w:pPr>
-      <w:r>
-        <w:t>Then krijgt hij alle mogelijke locaties</w:t>
-      </w:r>
-    </w:p>
-    <w:p>
-      <w:pPr>
-        <w:pStyle w:val="ListParagraph"/>
-        <w:numPr>
-          <w:ilvl w:val="1"/>
-          <w:numId w:val="1"/>
-        </w:numPr>
-      </w:pPr>
-      <w:r>
-        <w:t>When de user iets invoert dat niet bestaat</w:t>
-      </w:r>
-    </w:p>
-    <w:p>
-      <w:pPr>
-        <w:pStyle w:val="ListParagraph"/>
-        <w:numPr>
-          <w:ilvl w:val="2"/>
-          <w:numId w:val="1"/>
-        </w:numPr>
-      </w:pPr>
-      <w:r>
-        <w:t>Then krijgt hij een foutmelding</w:t>
-      </w:r>
-    </w:p>
-    <w:p>
-      <w:r>
+          <w:numId w:val="3"/>
+        </w:numPr>
+        <w:spacing w:before="100" w:beforeAutospacing="1" w:after="100" w:afterAutospacing="1" w:line="240" w:lineRule="auto"/>
+        <w:rPr>
+          <w:rFonts w:eastAsia="Times New Roman" w:cs="Times New Roman"/>
+          <w:lang w:eastAsia="nl-BE"/>
+          <w14:ligatures w14:val="none"/>
+        </w:rPr>
+      </w:pPr>
+      <w:r>
+        <w:rPr>
+          <w:rFonts w:eastAsia="Times New Roman" w:cs="Times New Roman"/>
+          <w:lang w:eastAsia="nl-BE"/>
+          <w14:ligatures w14:val="none"/>
+        </w:rPr>
+        <w:t xml:space="preserve">Then wordt de volledige lijst van historische locaties opnieuw getoond </w:t>
+      </w:r>
+    </w:p>
+    <w:p>
+      <w:pPr>
+        <w:pStyle w:val="ListParagraph"/>
+      </w:pPr>
+    </w:p>
+    <w:p>
+      <w:pPr>
         <w:rPr>
           <w:b/>
           <w:bCs/>
         </w:rPr>
-        <w:t>4:</w:t>
-      </w:r>
-    </w:p>
-    <w:p>
-      <w:r>
-        <w:t>Als een user die de website bezoekt, wil ik de mogelijkheid hebben om de lijst op de homepage te sorteren</w:t>
-      </w:r>
-      <w:r>
-        <w:t>, zodat ik de locaties kan zien in de volgorde dat ik wil.</w:t>
-      </w:r>
-    </w:p>
-    <w:p/>
-    <w:p>
-      <w:r>
-        <w:rPr>
-          <w:u w:val="single"/>
-        </w:rPr>
-        <w:t>Gherkin</w:t>
-      </w:r>
-      <w:r>
-        <w:t>:</w:t>
-      </w:r>
-    </w:p>
-    <w:p>
-      <w:pPr>
-        <w:pStyle w:val="ListParagraph"/>
-        <w:numPr>
-          <w:ilvl w:val="0"/>
-          <w:numId w:val="1"/>
-        </w:numPr>
-      </w:pPr>
-      <w:r>
-        <w:t>Given: een user kiest een bepaalde</w:t>
-      </w:r>
-      <w:r>
-        <w:t xml:space="preserve"> sorteermethode</w:t>
-      </w:r>
-    </w:p>
-    <w:p>
-      <w:pPr>
-        <w:pStyle w:val="ListParagraph"/>
-        <w:numPr>
-          <w:ilvl w:val="1"/>
-          <w:numId w:val="1"/>
-        </w:numPr>
-      </w:pPr>
-      <w:r>
-        <w:t>When deze sorteermethode kan toegepast worden op de huidige lijst</w:t>
-      </w:r>
-    </w:p>
-    <w:p>
-      <w:pPr>
-        <w:pStyle w:val="ListParagraph"/>
-        <w:numPr>
-          <w:ilvl w:val="2"/>
-          <w:numId w:val="1"/>
-        </w:numPr>
-      </w:pPr>
-      <w:r>
-        <w:t>Then wordt de huidige lijst aangepast en gesorteerd volgens zijn keuze</w:t>
-      </w:r>
-    </w:p>
-    <w:p>
-      <w:pPr>
-        <w:pStyle w:val="ListParagraph"/>
-        <w:numPr>
-          <w:ilvl w:val="1"/>
-          <w:numId w:val="1"/>
-        </w:numPr>
-      </w:pPr>
-      <w:r>
-        <w:t>When deze sorteermethode niet toe</w:t>
-      </w:r>
-      <w:r>
-        <w:t>gepast kan worden op de lijst</w:t>
-      </w:r>
-    </w:p>
-    <w:p>
-      <w:pPr>
-        <w:pStyle w:val="ListParagraph"/>
-        <w:numPr>
-          <w:ilvl w:val="2"/>
-          <w:numId w:val="1"/>
-        </w:numPr>
-      </w:pPr>
-      <w:r>
-        <w:t>Then krijgt hij een foutmelding</w:t>
-      </w:r>
-    </w:p>
-    <w:p>
+      </w:pPr>
       <w:r>
         <w:rPr>
           <w:b/>
           <w:bCs/>
         </w:rPr>
-        <w:t>5</w:t>
-      </w:r>
-      <w:r>
+        <w:t>3:</w:t>
+      </w:r>
+    </w:p>
+    <w:p>
+      <w:r>
+        <w:t>Als een user die de website bezoekt, wil ik de mogelijkheid hebben om een specifieke locatie op te zoeken, zodat ik op een snelle manier een locatie kan vinden.</w:t>
+      </w:r>
+    </w:p>
+    <w:p>
+      <w:pPr>
+        <w:rPr>
+          <w:u w:val="single"/>
+        </w:rPr>
+      </w:pPr>
+      <w:r>
+        <w:rPr>
+          <w:u w:val="single"/>
+        </w:rPr>
+        <w:t>Gherkin</w:t>
+      </w:r>
+    </w:p>
+    <w:p>
+      <w:pPr>
+        <w:rPr>
+          <w:u w:val="single"/>
+        </w:rPr>
+      </w:pPr>
+    </w:p>
+    <w:p>
+      <w:pPr>
+        <w:pStyle w:val="ListParagraph"/>
+        <w:numPr>
+          <w:ilvl w:val="0"/>
+          <w:numId w:val="5"/>
+        </w:numPr>
+      </w:pPr>
+      <w:r>
+        <w:t>Given een user gebruikt de zoekfunctie</w:t>
+      </w:r>
+    </w:p>
+    <w:p>
+      <w:pPr>
+        <w:pStyle w:val="ListParagraph"/>
+        <w:numPr>
+          <w:ilvl w:val="1"/>
+          <w:numId w:val="5"/>
+        </w:numPr>
+      </w:pPr>
+      <w:r>
+        <w:t>When de user één of meerdere letters invoert</w:t>
+      </w:r>
+    </w:p>
+    <w:p>
+      <w:pPr>
+        <w:pStyle w:val="ListParagraph"/>
+        <w:numPr>
+          <w:ilvl w:val="2"/>
+          <w:numId w:val="5"/>
+        </w:numPr>
+      </w:pPr>
+      <w:r>
+        <w:t xml:space="preserve">Then wordt de lijst dynamisch aangepast op basis van de ingevoerde naam </w:t>
+      </w:r>
+    </w:p>
+    <w:p>
+      <w:pPr>
+        <w:pStyle w:val="ListParagraph"/>
+        <w:numPr>
+          <w:ilvl w:val="0"/>
+          <w:numId w:val="5"/>
+        </w:numPr>
+      </w:pPr>
+      <w:r>
+        <w:t>Given een user gebruikt de zoekfunctie</w:t>
+      </w:r>
+    </w:p>
+    <w:p>
+      <w:pPr>
+        <w:pStyle w:val="ListParagraph"/>
+        <w:numPr>
+          <w:ilvl w:val="1"/>
+          <w:numId w:val="5"/>
+        </w:numPr>
+      </w:pPr>
+      <w:r>
+        <w:t>When de user niets invoert</w:t>
+      </w:r>
+    </w:p>
+    <w:p>
+      <w:pPr>
+        <w:pStyle w:val="ListParagraph"/>
+        <w:numPr>
+          <w:ilvl w:val="2"/>
+          <w:numId w:val="5"/>
+        </w:numPr>
+      </w:pPr>
+      <w:r>
+        <w:t xml:space="preserve">Then wordt de volledige lijst van locaties getoond </w:t>
+      </w:r>
+    </w:p>
+    <w:p>
+      <w:pPr>
+        <w:pStyle w:val="ListParagraph"/>
+        <w:numPr>
+          <w:ilvl w:val="0"/>
+          <w:numId w:val="5"/>
+        </w:numPr>
+      </w:pPr>
+      <w:r>
+        <w:t>Given een user gebruikt de zoekfuncti</w:t>
+      </w:r>
+      <w:r>
+        <w:t>e</w:t>
+      </w:r>
+    </w:p>
+    <w:p>
+      <w:pPr>
+        <w:pStyle w:val="ListParagraph"/>
+        <w:numPr>
+          <w:ilvl w:val="1"/>
+          <w:numId w:val="5"/>
+        </w:numPr>
+      </w:pPr>
+      <w:r>
+        <w:t>When de ingevoerde zoekterm met geen enkele locatie overeenkomt</w:t>
+      </w:r>
+    </w:p>
+    <w:p>
+      <w:pPr>
+        <w:pStyle w:val="ListParagraph"/>
+        <w:numPr>
+          <w:ilvl w:val="2"/>
+          <w:numId w:val="5"/>
+        </w:numPr>
+      </w:pPr>
+      <w:r>
+        <w:t>Then wordt een melding getoond dat er geen resultaten gevonden zijn</w:t>
+      </w:r>
+    </w:p>
+    <w:p/>
+    <w:p/>
+    <w:p/>
+    <w:p>
+      <w:pPr>
         <w:rPr>
           <w:b/>
           <w:bCs/>
         </w:rPr>
-        <w:t>:</w:t>
-      </w:r>
-    </w:p>
-    <w:p/>
-    <w:p>
-      <w:r>
-        <w:t>Als een user die de website bezoekt, wil ik</w:t>
-      </w:r>
-      <w:r>
-        <w:t xml:space="preserve"> </w:t>
-      </w:r>
-      <w:r>
-        <w:t xml:space="preserve">bepaalde locaties als favoriet kunnen opslaan, waarbij </w:t>
-      </w:r>
-      <w:r>
-        <w:t>deze locaties wordt bijgehouden tussen mijn sessies, zodat ik snel mijn locaties kan terug vinden.</w:t>
-      </w:r>
-    </w:p>
-    <w:p/>
-    <w:p>
-      <w:r>
-        <w:rPr>
-          <w:u w:val="single"/>
-        </w:rPr>
-        <w:t>Gherkin</w:t>
-      </w:r>
-    </w:p>
-    <w:p>
-      <w:pPr>
-        <w:pStyle w:val="ListParagraph"/>
-        <w:numPr>
-          <w:ilvl w:val="0"/>
-          <w:numId w:val="2"/>
-        </w:numPr>
-      </w:pPr>
-      <w:r>
-        <w:t xml:space="preserve">Given: </w:t>
-      </w:r>
-      <w:r>
-        <w:t xml:space="preserve">een user wilt </w:t>
-      </w:r>
-      <w:r>
-        <w:t>een locatie als favoriet toevoegen</w:t>
-      </w:r>
-    </w:p>
-    <w:p>
-      <w:pPr>
-        <w:pStyle w:val="ListParagraph"/>
-        <w:numPr>
-          <w:ilvl w:val="1"/>
-          <w:numId w:val="2"/>
-        </w:numPr>
-      </w:pPr>
-      <w:r>
-        <w:lastRenderedPageBreak/>
-        <w:t xml:space="preserve">When </w:t>
-      </w:r>
-      <w:r>
-        <w:t xml:space="preserve">deze locatie niet bestaat in de collectie </w:t>
-      </w:r>
-      <w:r>
-        <w:t>van favorieten van deze persoon niet bestaat</w:t>
-      </w:r>
-    </w:p>
-    <w:p>
-      <w:pPr>
-        <w:pStyle w:val="ListParagraph"/>
-        <w:numPr>
-          <w:ilvl w:val="2"/>
-          <w:numId w:val="2"/>
-        </w:numPr>
-      </w:pPr>
-      <w:r>
-        <w:t xml:space="preserve">Then deze </w:t>
-      </w:r>
-      <w:r>
-        <w:t>locatie</w:t>
-      </w:r>
-      <w:r>
-        <w:t xml:space="preserve"> </w:t>
-      </w:r>
-      <w:r>
-        <w:t>wordt als favoriet opgeslagen</w:t>
-      </w:r>
-    </w:p>
-    <w:p>
-      <w:pPr>
-        <w:pStyle w:val="ListParagraph"/>
-        <w:numPr>
-          <w:ilvl w:val="1"/>
-          <w:numId w:val="2"/>
-        </w:numPr>
-      </w:pPr>
-      <w:r>
-        <w:t xml:space="preserve">When deze </w:t>
-      </w:r>
-      <w:r>
-        <w:t xml:space="preserve">locatie </w:t>
-      </w:r>
-      <w:r>
-        <w:t>al bestaa</w:t>
-      </w:r>
-      <w:r>
-        <w:t>t</w:t>
-      </w:r>
-      <w:r>
-        <w:t xml:space="preserve"> in zijn </w:t>
-      </w:r>
-      <w:r>
-        <w:t>collectie</w:t>
-      </w:r>
-    </w:p>
-    <w:p>
-      <w:pPr>
-        <w:pStyle w:val="ListParagraph"/>
-        <w:numPr>
-          <w:ilvl w:val="2"/>
-          <w:numId w:val="2"/>
-        </w:numPr>
-      </w:pPr>
-      <w:r>
-        <w:t xml:space="preserve">Then </w:t>
-      </w:r>
-      <w:r>
-        <w:t>krijgt hij een bericht dat deze elementen al bestaan in zijn collectie</w:t>
-      </w:r>
-    </w:p>
-    <w:p>
+      </w:pPr>
       <w:r>
         <w:rPr>
           <w:b/>
           <w:bCs/>
         </w:rPr>
-        <w:t>6:</w:t>
+        <w:t>4:</w:t>
+      </w:r>
+    </w:p>
+    <w:p>
+      <w:r>
+        <w:t>Als een user die de website bezoekt, wil ik de mogelijkheid hebben om de lijst op de homepage te sorteren, zodat ik de locaties kan zien in de volgorde dat ik wil.</w:t>
+      </w:r>
+    </w:p>
+    <w:p>
+      <w:r>
+        <w:rPr>
+          <w:u w:val="single"/>
+        </w:rPr>
+        <w:t>Gherkin</w:t>
+      </w:r>
+      <w:r>
+        <w:t>:</w:t>
+      </w:r>
+    </w:p>
+    <w:p>
+      <w:pPr>
+        <w:numPr>
+          <w:ilvl w:val="0"/>
+          <w:numId w:val="6"/>
+        </w:numPr>
+        <w:spacing w:before="100" w:beforeAutospacing="1" w:after="100" w:afterAutospacing="1" w:line="240" w:lineRule="auto"/>
+        <w:rPr>
+          <w:rFonts w:eastAsia="Times New Roman" w:cs="Times New Roman"/>
+          <w:lang w:eastAsia="nl-BE"/>
+          <w14:ligatures w14:val="none"/>
+        </w:rPr>
+      </w:pPr>
+      <w:r>
+        <w:rPr>
+          <w:rFonts w:eastAsia="Times New Roman" w:cs="Times New Roman"/>
+          <w:lang w:eastAsia="nl-BE"/>
+          <w14:ligatures w14:val="none"/>
+        </w:rPr>
+        <w:t>Given een user kiest een sorteermethode</w:t>
+      </w:r>
+    </w:p>
+    <w:p>
+      <w:pPr>
+        <w:numPr>
+          <w:ilvl w:val="1"/>
+          <w:numId w:val="6"/>
+        </w:numPr>
+        <w:spacing w:before="100" w:beforeAutospacing="1" w:after="100" w:afterAutospacing="1" w:line="240" w:lineRule="auto"/>
+        <w:rPr>
+          <w:rFonts w:eastAsia="Times New Roman" w:cs="Times New Roman"/>
+          <w:lang w:eastAsia="nl-BE"/>
+          <w14:ligatures w14:val="none"/>
+        </w:rPr>
+      </w:pPr>
+      <w:r>
+        <w:rPr>
+          <w:rFonts w:eastAsia="Times New Roman" w:cs="Times New Roman"/>
+          <w:lang w:eastAsia="nl-BE"/>
+          <w14:ligatures w14:val="none"/>
+        </w:rPr>
+        <w:t>When de sorteermethode geldig is voor de huidige lijst</w:t>
+      </w:r>
+    </w:p>
+    <w:p>
+      <w:pPr>
+        <w:numPr>
+          <w:ilvl w:val="2"/>
+          <w:numId w:val="6"/>
+        </w:numPr>
+        <w:spacing w:before="100" w:beforeAutospacing="1" w:after="100" w:afterAutospacing="1" w:line="240" w:lineRule="auto"/>
+        <w:rPr>
+          <w:rFonts w:eastAsia="Times New Roman" w:cs="Times New Roman"/>
+          <w:lang w:eastAsia="nl-BE"/>
+          <w14:ligatures w14:val="none"/>
+        </w:rPr>
+      </w:pPr>
+      <w:r>
+        <w:rPr>
+          <w:rFonts w:eastAsia="Times New Roman" w:cs="Times New Roman"/>
+          <w:lang w:eastAsia="nl-BE"/>
+          <w14:ligatures w14:val="none"/>
+        </w:rPr>
+        <w:lastRenderedPageBreak/>
+        <w:t xml:space="preserve">Then wordt de lijst aangepast en gesorteerd volgens de gekozen methode </w:t>
+      </w:r>
+    </w:p>
+    <w:p>
+      <w:pPr>
+        <w:numPr>
+          <w:ilvl w:val="0"/>
+          <w:numId w:val="6"/>
+        </w:numPr>
+        <w:spacing w:before="100" w:beforeAutospacing="1" w:after="100" w:afterAutospacing="1" w:line="240" w:lineRule="auto"/>
+        <w:rPr>
+          <w:rFonts w:eastAsia="Times New Roman" w:cs="Times New Roman"/>
+          <w:lang w:eastAsia="nl-BE"/>
+          <w14:ligatures w14:val="none"/>
+        </w:rPr>
+      </w:pPr>
+      <w:r>
+        <w:rPr>
+          <w:rFonts w:eastAsia="Times New Roman" w:cs="Times New Roman"/>
+          <w:lang w:eastAsia="nl-BE"/>
+          <w14:ligatures w14:val="none"/>
+        </w:rPr>
+        <w:t>Given een user kiest een sorteermethode</w:t>
+      </w:r>
+    </w:p>
+    <w:p>
+      <w:pPr>
+        <w:numPr>
+          <w:ilvl w:val="1"/>
+          <w:numId w:val="6"/>
+        </w:numPr>
+        <w:spacing w:before="100" w:beforeAutospacing="1" w:after="100" w:afterAutospacing="1" w:line="240" w:lineRule="auto"/>
+        <w:rPr>
+          <w:rFonts w:eastAsia="Times New Roman" w:cs="Times New Roman"/>
+          <w:lang w:eastAsia="nl-BE"/>
+          <w14:ligatures w14:val="none"/>
+        </w:rPr>
+      </w:pPr>
+      <w:r>
+        <w:rPr>
+          <w:rFonts w:eastAsia="Times New Roman" w:cs="Times New Roman"/>
+          <w:lang w:eastAsia="nl-BE"/>
+          <w14:ligatures w14:val="none"/>
+        </w:rPr>
+        <w:t>When de sorteermethode niet kan worden toegepast</w:t>
+      </w:r>
+    </w:p>
+    <w:p>
+      <w:pPr>
+        <w:numPr>
+          <w:ilvl w:val="2"/>
+          <w:numId w:val="6"/>
+        </w:numPr>
+        <w:spacing w:before="100" w:beforeAutospacing="1" w:after="100" w:afterAutospacing="1" w:line="240" w:lineRule="auto"/>
+        <w:rPr>
+          <w:rFonts w:eastAsia="Times New Roman" w:cs="Times New Roman"/>
+          <w:lang w:eastAsia="nl-BE"/>
+          <w14:ligatures w14:val="none"/>
+        </w:rPr>
+      </w:pPr>
+      <w:r>
+        <w:rPr>
+          <w:rFonts w:eastAsia="Times New Roman" w:cs="Times New Roman"/>
+          <w:lang w:eastAsia="nl-BE"/>
+          <w14:ligatures w14:val="none"/>
+        </w:rPr>
+        <w:t xml:space="preserve">Then wordt een foutmelding of waarschuwing getoond </w:t>
+      </w:r>
+    </w:p>
+    <w:p>
+      <w:pPr>
+        <w:numPr>
+          <w:ilvl w:val="0"/>
+          <w:numId w:val="6"/>
+        </w:numPr>
+        <w:spacing w:before="100" w:beforeAutospacing="1" w:after="100" w:afterAutospacing="1" w:line="240" w:lineRule="auto"/>
+        <w:rPr>
+          <w:rFonts w:eastAsia="Times New Roman" w:cs="Times New Roman"/>
+          <w:lang w:eastAsia="nl-BE"/>
+          <w14:ligatures w14:val="none"/>
+        </w:rPr>
+      </w:pPr>
+      <w:r>
+        <w:rPr>
+          <w:rFonts w:eastAsia="Times New Roman" w:cs="Times New Roman"/>
+          <w:lang w:eastAsia="nl-BE"/>
+          <w14:ligatures w14:val="none"/>
+        </w:rPr>
+        <w:t>Given een user heeft een sorteermethode gekozen</w:t>
+      </w:r>
+    </w:p>
+    <w:p>
+      <w:pPr>
+        <w:numPr>
+          <w:ilvl w:val="1"/>
+          <w:numId w:val="6"/>
+        </w:numPr>
+        <w:spacing w:before="100" w:beforeAutospacing="1" w:after="100" w:afterAutospacing="1" w:line="240" w:lineRule="auto"/>
+        <w:rPr>
+          <w:rFonts w:eastAsia="Times New Roman" w:cs="Times New Roman"/>
+          <w:lang w:eastAsia="nl-BE"/>
+          <w14:ligatures w14:val="none"/>
+        </w:rPr>
+      </w:pPr>
+      <w:r>
+        <w:rPr>
+          <w:rFonts w:eastAsia="Times New Roman" w:cs="Times New Roman"/>
+          <w:lang w:eastAsia="nl-BE"/>
+          <w14:ligatures w14:val="none"/>
+        </w:rPr>
+        <w:t>When de sortering toegepast is</w:t>
+      </w:r>
+    </w:p>
+    <w:p>
+      <w:pPr>
+        <w:numPr>
+          <w:ilvl w:val="2"/>
+          <w:numId w:val="6"/>
+        </w:numPr>
+        <w:spacing w:before="100" w:beforeAutospacing="1" w:after="100" w:afterAutospacing="1" w:line="240" w:lineRule="auto"/>
+        <w:rPr>
+          <w:rFonts w:eastAsia="Times New Roman" w:cs="Times New Roman"/>
+          <w:lang w:eastAsia="nl-BE"/>
+          <w14:ligatures w14:val="none"/>
+        </w:rPr>
+      </w:pPr>
+      <w:r>
+        <w:rPr>
+          <w:rFonts w:eastAsia="Times New Roman" w:cs="Times New Roman"/>
+          <w:lang w:eastAsia="nl-BE"/>
+          <w14:ligatures w14:val="none"/>
+        </w:rPr>
+        <w:t xml:space="preserve">Then blijft de volledige lijst zichtbaar in de nieuwe volgorde </w:t>
       </w:r>
     </w:p>
     <w:p/>
     <w:p>
-      <w:r>
-        <w:t>Als een user die de website bezoekt, wil ik de mogelijkheid om bepaalde voorkeuren (bijvoorbeeld: mijn taal) te veranderen en die op te slagen doorheen verschillende sessies.</w:t>
-      </w:r>
-    </w:p>
-    <w:p/>
-    <w:p>
-      <w:pPr>
-        <w:pStyle w:val="ListParagraph"/>
-        <w:numPr>
-          <w:ilvl w:val="0"/>
-          <w:numId w:val="2"/>
-        </w:numPr>
-      </w:pPr>
-      <w:r>
-        <w:t>Given: een user veranderd een persoonlijke voorkeur</w:t>
-      </w:r>
-    </w:p>
-    <w:p>
-      <w:pPr>
-        <w:pStyle w:val="ListParagraph"/>
-        <w:numPr>
-          <w:ilvl w:val="1"/>
-          <w:numId w:val="2"/>
-        </w:numPr>
-      </w:pPr>
-      <w:r>
-        <w:t>When</w:t>
-      </w:r>
-      <w:r>
-        <w:t xml:space="preserve"> de user een voorkeur kie</w:t>
-      </w:r>
-      <w:r>
-        <w:t>st</w:t>
-      </w:r>
-    </w:p>
-    <w:p>
-      <w:pPr>
-        <w:pStyle w:val="ListParagraph"/>
-        <w:numPr>
-          <w:ilvl w:val="2"/>
-          <w:numId w:val="2"/>
-        </w:numPr>
-      </w:pPr>
-      <w:r>
-        <w:t xml:space="preserve">Then wordt het opgeslagen </w:t>
-      </w:r>
-    </w:p>
-    <w:p>
-      <w:pPr>
-        <w:pStyle w:val="ListParagraph"/>
-        <w:numPr>
-          <w:ilvl w:val="1"/>
-          <w:numId w:val="2"/>
-        </w:numPr>
-      </w:pPr>
-      <w:r>
-        <w:t>….</w:t>
-      </w:r>
-    </w:p>
-    <w:p/>
-    <w:p>
-      <w:r>
+      <w:pPr>
         <w:rPr>
           <w:b/>
           <w:bCs/>
         </w:rPr>
-        <w:t>7</w:t>
-      </w:r>
+      </w:pPr>
       <w:r>
         <w:rPr>
           <w:b/>
           <w:bCs/>
         </w:rPr>
-        <w:t>:</w:t>
-      </w:r>
-    </w:p>
-    <w:p>
-      <w:r>
-        <w:t xml:space="preserve">Als een user die de website bezoekt, wil ik de mogelijkheid hebben om deze website op verschillende devices te bezoeken met verschillende dimensies </w:t>
-      </w:r>
-      <w:r>
-        <w:t>met een aangename en duidelijke interface, zodat ik deze website overal en op alle devices kan bezoeken.</w:t>
-      </w:r>
-    </w:p>
-    <w:p/>
-    <w:p>
-      <w:r>
-        <w:rPr>
-          <w:u w:val="single"/>
-        </w:rPr>
-        <w:t>Gherkin</w:t>
-      </w:r>
-      <w:r>
-        <w:rPr>
-          <w:u w:val="single"/>
-        </w:rPr>
-        <w:t>:</w:t>
-      </w:r>
-    </w:p>
-    <w:p>
-      <w:pPr>
-        <w:pStyle w:val="ListParagraph"/>
-        <w:numPr>
-          <w:ilvl w:val="0"/>
-          <w:numId w:val="2"/>
-        </w:numPr>
-      </w:pPr>
-      <w:r>
-        <w:t xml:space="preserve">Given: </w:t>
-      </w:r>
-      <w:r>
-        <w:t>de user laadt de website</w:t>
-      </w:r>
-    </w:p>
-    <w:p>
-      <w:pPr>
-        <w:pStyle w:val="ListParagraph"/>
-        <w:numPr>
-          <w:ilvl w:val="1"/>
-          <w:numId w:val="2"/>
-        </w:numPr>
-      </w:pPr>
-      <w:r>
-        <w:t>When de scherm van de user is breed</w:t>
-      </w:r>
-    </w:p>
-    <w:p>
-      <w:pPr>
-        <w:pStyle w:val="ListParagraph"/>
-        <w:numPr>
-          <w:ilvl w:val="2"/>
-          <w:numId w:val="2"/>
-        </w:numPr>
-      </w:pPr>
-      <w:r>
-        <w:t xml:space="preserve">Then de layout </w:t>
-      </w:r>
-      <w:r>
-        <w:t>wordt gespreid over de hele breedte van de scherm (elementen zetten zich naast elkaar)</w:t>
-      </w:r>
-    </w:p>
-    <w:p>
-      <w:pPr>
-        <w:pStyle w:val="ListParagraph"/>
-        <w:numPr>
-          <w:ilvl w:val="1"/>
-          <w:numId w:val="2"/>
-        </w:numPr>
-      </w:pPr>
-      <w:r>
-        <w:t>When de scherm van de user is small</w:t>
-      </w:r>
-    </w:p>
-    <w:p>
-      <w:pPr>
-        <w:pStyle w:val="ListParagraph"/>
-        <w:numPr>
-          <w:ilvl w:val="2"/>
-          <w:numId w:val="2"/>
-        </w:numPr>
-      </w:pPr>
-      <w:r>
-        <w:t>Then de layout wordt gespreid over de lengte van de scherm (elementen zetten zich onder elkaar)</w:t>
-      </w:r>
-    </w:p>
-    <w:p/>
-    <w:p>
+        <w:t>5</w:t>
+      </w:r>
       <w:r>
         <w:rPr>
           <w:b/>
           <w:bCs/>
         </w:rPr>
+        <w:t>:</w:t>
+      </w:r>
+    </w:p>
+    <w:p/>
+    <w:p>
+      <w:r>
+        <w:t>Als een user die de website bezoekt, wil ik bepaalde locaties als favoriet kunnen opslaan, waarbij deze locaties worden bijgehouden tussen mijn sessies, zodat ik snel mijn locaties kan terugvinden.</w:t>
+      </w:r>
+    </w:p>
+    <w:p/>
+    <w:p>
+      <w:r>
+        <w:rPr>
+          <w:u w:val="single"/>
+        </w:rPr>
+        <w:t>Gherkin</w:t>
+      </w:r>
+    </w:p>
+    <w:p/>
+    <w:p>
+      <w:pPr>
+        <w:pStyle w:val="ListParagraph"/>
+        <w:numPr>
+          <w:ilvl w:val="0"/>
+          <w:numId w:val="8"/>
+        </w:numPr>
+      </w:pPr>
+      <w:r>
+        <w:t>Given een user wil een locatie als favoriet toevoegen</w:t>
+      </w:r>
+    </w:p>
+    <w:p>
+      <w:pPr>
+        <w:pStyle w:val="ListParagraph"/>
+        <w:numPr>
+          <w:ilvl w:val="1"/>
+          <w:numId w:val="8"/>
+        </w:numPr>
+      </w:pPr>
+      <w:r>
+        <w:t>When deze locatie nog niet in de favorietenlijst staat</w:t>
+      </w:r>
+    </w:p>
+    <w:p>
+      <w:pPr>
+        <w:pStyle w:val="ListParagraph"/>
+        <w:numPr>
+          <w:ilvl w:val="2"/>
+          <w:numId w:val="8"/>
+        </w:numPr>
+      </w:pPr>
+      <w:r>
+        <w:t xml:space="preserve">Then wordt deze locatie toegevoegd aan de favorieten </w:t>
+      </w:r>
+    </w:p>
+    <w:p>
+      <w:pPr>
+        <w:pStyle w:val="ListParagraph"/>
+        <w:numPr>
+          <w:ilvl w:val="0"/>
+          <w:numId w:val="8"/>
+        </w:numPr>
+      </w:pPr>
+      <w:r>
+        <w:t>Given een user wil een locatie als favoriet toevoegen</w:t>
+      </w:r>
+    </w:p>
+    <w:p>
+      <w:pPr>
+        <w:pStyle w:val="ListParagraph"/>
+        <w:numPr>
+          <w:ilvl w:val="1"/>
+          <w:numId w:val="8"/>
+        </w:numPr>
+      </w:pPr>
+      <w:r>
+        <w:t>When deze locatie al in de favorietenlijst staat</w:t>
+      </w:r>
+    </w:p>
+    <w:p>
+      <w:pPr>
+        <w:pStyle w:val="ListParagraph"/>
+        <w:numPr>
+          <w:ilvl w:val="2"/>
+          <w:numId w:val="8"/>
+        </w:numPr>
+      </w:pPr>
+      <w:r>
+        <w:t xml:space="preserve">Then krijgt de user een melding dat deze locatie al als favoriet bestaat </w:t>
+      </w:r>
+    </w:p>
+    <w:p>
+      <w:pPr>
+        <w:pStyle w:val="ListParagraph"/>
+        <w:numPr>
+          <w:ilvl w:val="0"/>
+          <w:numId w:val="8"/>
+        </w:numPr>
+      </w:pPr>
+      <w:r>
+        <w:t>Given een user heeft favorieten opgeslagen</w:t>
+      </w:r>
+    </w:p>
+    <w:p>
+      <w:pPr>
+        <w:pStyle w:val="ListParagraph"/>
+        <w:numPr>
+          <w:ilvl w:val="1"/>
+          <w:numId w:val="8"/>
+        </w:numPr>
+      </w:pPr>
+      <w:r>
+        <w:t>When de user de website opnieuw bezoekt</w:t>
+      </w:r>
+    </w:p>
+    <w:p>
+      <w:pPr>
+        <w:pStyle w:val="ListParagraph"/>
+        <w:numPr>
+          <w:ilvl w:val="2"/>
+          <w:numId w:val="8"/>
+        </w:numPr>
+      </w:pPr>
+      <w:r>
+        <w:t>Then blijven de favoriete locaties bewaard en zichtbaar</w:t>
+      </w:r>
+    </w:p>
+    <w:p/>
+    <w:p>
+      <w:pPr>
+        <w:rPr>
+          <w:b/>
+          <w:bCs/>
+        </w:rPr>
+      </w:pPr>
+      <w:r>
+        <w:rPr>
+          <w:b/>
+          <w:bCs/>
+        </w:rPr>
+        <w:t>6:</w:t>
+      </w:r>
+    </w:p>
+    <w:p/>
+    <w:p>
+      <w:r>
+        <w:t>Als een user die de website bezoekt, wil ik de mogelijkheid hebben om bepaalde voorkeuren (bijvoorbeeld mijn taal) te veranderen en die op te slaan doorheen verschillende sessies.</w:t>
+      </w:r>
+    </w:p>
+    <w:p/>
+    <w:p/>
+    <w:p>
+      <w:pPr>
+        <w:pStyle w:val="ListParagraph"/>
+        <w:numPr>
+          <w:ilvl w:val="0"/>
+          <w:numId w:val="9"/>
+        </w:numPr>
+      </w:pPr>
+      <w:r>
+        <w:lastRenderedPageBreak/>
+        <w:t>Given een user verandert een persoonlijke voorkeur</w:t>
+      </w:r>
+    </w:p>
+    <w:p>
+      <w:pPr>
+        <w:pStyle w:val="ListParagraph"/>
+        <w:numPr>
+          <w:ilvl w:val="1"/>
+          <w:numId w:val="9"/>
+        </w:numPr>
+      </w:pPr>
+      <w:r>
+        <w:t>When de user een nieuwe voorkeur kiest</w:t>
+      </w:r>
+    </w:p>
+    <w:p>
+      <w:pPr>
+        <w:pStyle w:val="ListParagraph"/>
+        <w:numPr>
+          <w:ilvl w:val="2"/>
+          <w:numId w:val="9"/>
+        </w:numPr>
+      </w:pPr>
+      <w:r>
+        <w:t xml:space="preserve">Then wordt deze voorkeur opgeslagen </w:t>
+      </w:r>
+    </w:p>
+    <w:p>
+      <w:pPr>
+        <w:pStyle w:val="ListParagraph"/>
+        <w:numPr>
+          <w:ilvl w:val="0"/>
+          <w:numId w:val="9"/>
+        </w:numPr>
+      </w:pPr>
+      <w:r>
+        <w:t>Given een user heeft een voorkeur opgeslagen</w:t>
+      </w:r>
+    </w:p>
+    <w:p>
+      <w:pPr>
+        <w:pStyle w:val="ListParagraph"/>
+        <w:numPr>
+          <w:ilvl w:val="1"/>
+          <w:numId w:val="9"/>
+        </w:numPr>
+      </w:pPr>
+      <w:r>
+        <w:t>When de user de website opnieuw opent</w:t>
+      </w:r>
+    </w:p>
+    <w:p>
+      <w:pPr>
+        <w:pStyle w:val="ListParagraph"/>
+        <w:numPr>
+          <w:ilvl w:val="2"/>
+          <w:numId w:val="9"/>
+        </w:numPr>
+      </w:pPr>
+      <w:r>
+        <w:t xml:space="preserve">Then wordt de opgeslagen voorkeur automatisch opnieuw toegepast </w:t>
+      </w:r>
+    </w:p>
+    <w:p>
+      <w:pPr>
+        <w:pStyle w:val="ListParagraph"/>
+        <w:numPr>
+          <w:ilvl w:val="0"/>
+          <w:numId w:val="9"/>
+        </w:numPr>
+      </w:pPr>
+      <w:r>
+        <w:t>Given een user bezoekt de website voor de eerste keer</w:t>
+      </w:r>
+    </w:p>
+    <w:p>
+      <w:pPr>
+        <w:pStyle w:val="ListParagraph"/>
+        <w:numPr>
+          <w:ilvl w:val="1"/>
+          <w:numId w:val="9"/>
+        </w:numPr>
+      </w:pPr>
+      <w:r>
+        <w:t>When er nog geen voorkeur opgeslagen is</w:t>
+      </w:r>
+    </w:p>
+    <w:p>
+      <w:pPr>
+        <w:pStyle w:val="ListParagraph"/>
+        <w:numPr>
+          <w:ilvl w:val="2"/>
+          <w:numId w:val="9"/>
+        </w:numPr>
+      </w:pPr>
+      <w:r>
+        <w:t>Then wordt een standaardvoorkeur toegepast</w:t>
+      </w:r>
+    </w:p>
+    <w:p/>
+    <w:p>
+      <w:pPr>
+        <w:rPr>
+          <w:b/>
+          <w:bCs/>
+        </w:rPr>
+      </w:pPr>
+      <w:r>
+        <w:rPr>
+          <w:b/>
+          <w:bCs/>
+        </w:rPr>
+        <w:t>7</w:t>
+      </w:r>
+      <w:r>
+        <w:rPr>
+          <w:b/>
+          <w:bCs/>
+        </w:rPr>
+        <w:t>:</w:t>
+      </w:r>
+    </w:p>
+    <w:p>
+      <w:r>
+        <w:t>Als een user die de website bezoekt, wil ik de mogelijkheid hebben om deze website op verschillende devices te bezoeken met verschillende dimensies met een aangename en duidelijke interface, zodat ik deze website overal en op alle devices kan bezoeken.</w:t>
+      </w:r>
+    </w:p>
+    <w:p>
+      <w:r>
+        <w:rPr>
+          <w:u w:val="single"/>
+        </w:rPr>
+        <w:t>Gherkin:</w:t>
+      </w:r>
+    </w:p>
+    <w:p>
+      <w:pPr>
+        <w:pStyle w:val="ListParagraph"/>
+        <w:numPr>
+          <w:ilvl w:val="0"/>
+          <w:numId w:val="10"/>
+        </w:numPr>
+      </w:pPr>
+      <w:r>
+        <w:t>Given een user opent de website</w:t>
+      </w:r>
+    </w:p>
+    <w:p>
+      <w:pPr>
+        <w:pStyle w:val="ListParagraph"/>
+        <w:numPr>
+          <w:ilvl w:val="1"/>
+          <w:numId w:val="10"/>
+        </w:numPr>
+      </w:pPr>
+      <w:r>
+        <w:t>When het scherm breed genoeg is</w:t>
+      </w:r>
+    </w:p>
+    <w:p>
+      <w:pPr>
+        <w:pStyle w:val="ListParagraph"/>
+        <w:numPr>
+          <w:ilvl w:val="2"/>
+          <w:numId w:val="10"/>
+        </w:numPr>
+      </w:pPr>
+      <w:r>
+        <w:t xml:space="preserve">Then worden de elementen naast elkaar weergegeven in een ruime </w:t>
+      </w:r>
+      <w:proofErr w:type="spellStart"/>
+      <w:r>
+        <w:t>layout</w:t>
+      </w:r>
+      <w:proofErr w:type="spellEnd"/>
+      <w:r>
+        <w:t xml:space="preserve"> </w:t>
+      </w:r>
+    </w:p>
+    <w:p>
+      <w:pPr>
+        <w:pStyle w:val="ListParagraph"/>
+        <w:numPr>
+          <w:ilvl w:val="0"/>
+          <w:numId w:val="10"/>
+        </w:numPr>
+      </w:pPr>
+      <w:r>
+        <w:t>Given een user opent de website</w:t>
+      </w:r>
+    </w:p>
+    <w:p>
+      <w:pPr>
+        <w:pStyle w:val="ListParagraph"/>
+        <w:numPr>
+          <w:ilvl w:val="1"/>
+          <w:numId w:val="10"/>
+        </w:numPr>
+      </w:pPr>
+      <w:r>
+        <w:t>When het scherm smal is</w:t>
+      </w:r>
+    </w:p>
+    <w:p>
+      <w:pPr>
+        <w:pStyle w:val="ListParagraph"/>
+        <w:numPr>
+          <w:ilvl w:val="2"/>
+          <w:numId w:val="10"/>
+        </w:numPr>
+      </w:pPr>
+      <w:r>
+        <w:t xml:space="preserve">Then worden de elementen onder elkaar weergegeven voor een betere leesbaarheid </w:t>
+      </w:r>
+    </w:p>
+    <w:p>
+      <w:pPr>
+        <w:pStyle w:val="ListParagraph"/>
+        <w:numPr>
+          <w:ilvl w:val="0"/>
+          <w:numId w:val="10"/>
+        </w:numPr>
+      </w:pPr>
+      <w:r>
+        <w:t>Given een user bezoekt de website op een ander device</w:t>
+      </w:r>
+    </w:p>
+    <w:p>
+      <w:pPr>
+        <w:pStyle w:val="ListParagraph"/>
+        <w:numPr>
+          <w:ilvl w:val="1"/>
+          <w:numId w:val="10"/>
+        </w:numPr>
+      </w:pPr>
+      <w:r>
+        <w:t>When de schermgrootte verandert</w:t>
+      </w:r>
+    </w:p>
+    <w:p>
+      <w:pPr>
+        <w:pStyle w:val="ListParagraph"/>
+        <w:numPr>
+          <w:ilvl w:val="2"/>
+          <w:numId w:val="10"/>
+        </w:numPr>
+      </w:pPr>
+      <w:r>
+        <w:t xml:space="preserve">Then past de </w:t>
+      </w:r>
+      <w:proofErr w:type="spellStart"/>
+      <w:r>
+        <w:t>layout</w:t>
+      </w:r>
+      <w:proofErr w:type="spellEnd"/>
+      <w:r>
+        <w:t xml:space="preserve"> zich automatisch aan zonder functionaliteiten te verliezen</w:t>
+      </w:r>
+    </w:p>
+    <w:p>
+      <w:pPr>
+        <w:rPr>
+          <w:b/>
+          <w:bCs/>
+        </w:rPr>
+      </w:pPr>
+      <w:r>
+        <w:rPr>
+          <w:b/>
+          <w:bCs/>
+        </w:rPr>
         <w:t>8:</w:t>
       </w:r>
     </w:p>
     <w:p>
       <w:r>
+        <w:t>Als een user die de website bezoekt, wil ik een duidelijke en aantrekkelijke UI, waarvan de knoppen duidelijk aantonen wat hun functies zijn, zodat ik de website op een efficiënte manier kan gebruiken.</w:t>
+      </w:r>
+    </w:p>
+    <w:p>
+      <w:pPr>
+        <w:pStyle w:val="ListParagraph"/>
+        <w:numPr>
+          <w:ilvl w:val="0"/>
+          <w:numId w:val="11"/>
+        </w:numPr>
+      </w:pPr>
+      <w:r>
+        <w:t>Given een user bezoekt de website</w:t>
+      </w:r>
+    </w:p>
+    <w:p>
+      <w:pPr>
+        <w:pStyle w:val="ListParagraph"/>
+        <w:numPr>
+          <w:ilvl w:val="1"/>
+          <w:numId w:val="11"/>
+        </w:numPr>
+      </w:pPr>
+      <w:r>
+        <w:t>When de interface geladen wordt</w:t>
+      </w:r>
+    </w:p>
+    <w:p>
+      <w:pPr>
+        <w:pStyle w:val="ListParagraph"/>
+        <w:numPr>
+          <w:ilvl w:val="2"/>
+          <w:numId w:val="11"/>
+        </w:numPr>
+      </w:pPr>
+      <w:r>
+        <w:t xml:space="preserve">Then ziet de user een duidelijke, gestructureerde en aantrekkelijke lay-out </w:t>
+      </w:r>
+    </w:p>
+    <w:p>
+      <w:pPr>
+        <w:pStyle w:val="ListParagraph"/>
+        <w:numPr>
+          <w:ilvl w:val="0"/>
+          <w:numId w:val="11"/>
+        </w:numPr>
+      </w:pPr>
+      <w:r>
+        <w:t>Given een user gebruikt de interface</w:t>
+      </w:r>
+    </w:p>
+    <w:p>
+      <w:pPr>
+        <w:pStyle w:val="ListParagraph"/>
+        <w:numPr>
+          <w:ilvl w:val="1"/>
+          <w:numId w:val="11"/>
+        </w:numPr>
+      </w:pPr>
+      <w:r>
         <w:lastRenderedPageBreak/>
-        <w:t>Als een user die de website bezoekt, wil ik een duidelijke een aantrekkelijke UI, waarvan de button duidelijk aantonen wat hun functies zijn, zodat ik de website op een efficiënte manier kan gebruiken</w:t>
-      </w:r>
-      <w:r>
-        <w:t>.</w:t>
-      </w:r>
-    </w:p>
-    <w:p/>
+        <w:t>When de user naar een knop kijkt</w:t>
+      </w:r>
+    </w:p>
+    <w:p>
+      <w:pPr>
+        <w:pStyle w:val="ListParagraph"/>
+        <w:numPr>
+          <w:ilvl w:val="2"/>
+          <w:numId w:val="11"/>
+        </w:numPr>
+      </w:pPr>
+      <w:r>
+        <w:t xml:space="preserve">Then moet duidelijk zijn welke functie deze knop uitvoert </w:t>
+      </w:r>
+    </w:p>
     <w:p>
       <w:pPr>
         <w:pStyle w:val="ListParagraph"/>
         <w:numPr>
           <w:ilvl w:val="0"/>
-          <w:numId w:val="2"/>
-        </w:numPr>
-      </w:pPr>
-      <w:r>
-        <w:t>Given</w:t>
-      </w:r>
+          <w:numId w:val="11"/>
+        </w:numPr>
+      </w:pPr>
+      <w:r>
+        <w:t>Given een user beweegt over interactieve elementen</w:t>
+      </w:r>
+    </w:p>
+    <w:p>
+      <w:pPr>
+        <w:pStyle w:val="ListParagraph"/>
+        <w:numPr>
+          <w:ilvl w:val="1"/>
+          <w:numId w:val="11"/>
+        </w:numPr>
+      </w:pPr>
+      <w:r>
+        <w:t>When de knoppen of links actief zijn</w:t>
+      </w:r>
+    </w:p>
+    <w:p>
+      <w:pPr>
+        <w:pStyle w:val="ListParagraph"/>
+        <w:numPr>
+          <w:ilvl w:val="2"/>
+          <w:numId w:val="11"/>
+        </w:numPr>
+      </w:pPr>
+      <w:r>
+        <w:t xml:space="preserve">Then krijgt de user visuele feedback dat deze elementen </w:t>
+      </w:r>
+      <w:proofErr w:type="spellStart"/>
+      <w:r>
+        <w:t>klikbaar</w:t>
+      </w:r>
+      <w:proofErr w:type="spellEnd"/>
+      <w:r>
+        <w:t xml:space="preserve"> zijn </w:t>
+      </w:r>
+    </w:p>
+    <w:p>
+      <w:pPr>
+        <w:pStyle w:val="ListParagraph"/>
+        <w:numPr>
+          <w:ilvl w:val="0"/>
+          <w:numId w:val="11"/>
+        </w:numPr>
+      </w:pPr>
+      <w:r>
+        <w:t>Given een user gebruikt de website</w:t>
+      </w:r>
+    </w:p>
+    <w:p>
+      <w:pPr>
+        <w:pStyle w:val="ListParagraph"/>
+        <w:numPr>
+          <w:ilvl w:val="1"/>
+          <w:numId w:val="11"/>
+        </w:numPr>
+      </w:pPr>
+      <w:r>
+        <w:t>When de user navigeert tussen de verschillende functies</w:t>
+      </w:r>
+    </w:p>
+    <w:p>
+      <w:pPr>
+        <w:pStyle w:val="ListParagraph"/>
+        <w:numPr>
+          <w:ilvl w:val="2"/>
+          <w:numId w:val="11"/>
+        </w:numPr>
+      </w:pPr>
+      <w:r>
+        <w:t xml:space="preserve">Then blijft de interface consistent en gebruiksvriendelijk </w:t>
+      </w:r>
+    </w:p>
+    <w:p>
+      <w:pPr>
+        <w:pStyle w:val="ListParagraph"/>
+      </w:pPr>
     </w:p>
     <w:sectPr>
       <w:pgSz w:w="11906" w:h="16838"/>
@@ -845,6 +1391,268 @@
 <file path=word/numbering.xml><?xml version="1.0" encoding="utf-8"?>
 <w:numbering xmlns:wpc="http://schemas.microsoft.com/office/word/2010/wordprocessingCanvas" xmlns:cx="http://schemas.microsoft.com/office/drawing/2014/chartex" xmlns:cx1="http://schemas.microsoft.com/office/drawing/2015/9/8/chartex" xmlns:cx2="http://schemas.microsoft.com/office/drawing/2015/10/21/chartex" xmlns:cx3="http://schemas.microsoft.com/office/drawing/2016/5/9/chartex" xmlns:cx4="http://schemas.microsoft.com/office/drawing/2016/5/10/chartex" xmlns:cx5="http://schemas.microsoft.com/office/drawing/2016/5/11/chartex" xmlns:cx6="http://schemas.microsoft.com/office/drawing/2016/5/12/chartex" xmlns:cx7="http://schemas.microsoft.com/office/drawing/2016/5/13/chartex" xmlns:cx8="http://schemas.microsoft.com/office/drawing/2016/5/14/chartex" xmlns:mc="http://schemas.openxmlformats.org/markup-compatibility/2006" xmlns:aink="http://schemas.microsoft.com/office/drawing/2016/ink" xmlns:am3d="http://schemas.microsoft.com/office/drawing/2017/model3d" xmlns:o="urn:schemas-microsoft-com:office:office" xmlns:oel="http://schemas.microsoft.com/office/2019/extlst" xmlns:r="http://schemas.openxmlformats.org/officeDocument/2006/relationships" xmlns:m="http://schemas.openxmlformats.org/officeDocument/2006/math" xmlns:v="urn:schemas-microsoft-com:vml" xmlns:wp14="http://schemas.microsoft.com/office/word/2010/wordprocessingDrawing" xmlns:wp="http://schemas.openxmlformats.org/drawingml/2006/wordprocessingDrawing" xmlns:w10="urn:schemas-microsoft-com:office:word" xmlns:w="http://schemas.openxmlformats.org/wordprocessingml/2006/main" xmlns:w14="http://schemas.microsoft.com/office/word/2010/wordml" xmlns:w15="http://schemas.microsoft.com/office/word/2012/wordml" xmlns:w16cex="http://schemas.microsoft.com/office/word/2018/wordml/cex" xmlns:w16cid="http://schemas.microsoft.com/office/word/2016/wordml/cid" xmlns:w16="http://schemas.microsoft.com/office/word/2018/wordml" xmlns:w16du="http://schemas.microsoft.com/office/word/2023/wordml/word16du" xmlns:w16sdtdh="http://schemas.microsoft.com/office/word/2020/wordml/sdtdatahash" xmlns:w16sdtfl="http://schemas.microsoft.com/office/word/2024/wordml/sdtformatlock" xmlns:w16se="http://schemas.microsoft.com/office/word/2015/wordml/symex" xmlns:wpg="http://schemas.microsoft.com/office/word/2010/wordprocessingGroup" xmlns:wpi="http://schemas.microsoft.com/office/word/2010/wordprocessingInk" xmlns:wne="http://schemas.microsoft.com/office/word/2006/wordml" xmlns:wps="http://schemas.microsoft.com/office/word/2010/wordprocessingShape" mc:Ignorable="w14 w15 w16se w16cid w16 w16cex w16sdtdh w16sdtfl w16du wp14">
   <w:abstractNum w:abstractNumId="0" w15:restartNumberingAfterBreak="0">
+    <w:nsid w:val="06257328"/>
+    <w:multiLevelType w:val="hybridMultilevel"/>
+    <w:tmpl w:val="2D44EF32"/>
+    <w:lvl w:ilvl="0" w:tplc="08130001">
+      <w:start w:val="1"/>
+      <w:numFmt w:val="bullet"/>
+      <w:lvlText w:val=""/>
+      <w:lvlJc w:val="left"/>
+      <w:pPr>
+        <w:ind w:left="720" w:hanging="360"/>
+      </w:pPr>
+      <w:rPr>
+        <w:rFonts w:ascii="Symbol" w:hAnsi="Symbol" w:hint="default"/>
+      </w:rPr>
+    </w:lvl>
+    <w:lvl w:ilvl="1" w:tplc="08130003">
+      <w:start w:val="1"/>
+      <w:numFmt w:val="bullet"/>
+      <w:lvlText w:val="o"/>
+      <w:lvlJc w:val="left"/>
+      <w:pPr>
+        <w:ind w:left="1440" w:hanging="360"/>
+      </w:pPr>
+      <w:rPr>
+        <w:rFonts w:ascii="Courier New" w:hAnsi="Courier New" w:cs="Courier New" w:hint="default"/>
+      </w:rPr>
+    </w:lvl>
+    <w:lvl w:ilvl="2" w:tplc="08130005">
+      <w:start w:val="1"/>
+      <w:numFmt w:val="bullet"/>
+      <w:lvlText w:val=""/>
+      <w:lvlJc w:val="left"/>
+      <w:pPr>
+        <w:ind w:left="2160" w:hanging="360"/>
+      </w:pPr>
+      <w:rPr>
+        <w:rFonts w:ascii="Wingdings" w:hAnsi="Wingdings" w:hint="default"/>
+      </w:rPr>
+    </w:lvl>
+    <w:lvl w:ilvl="3" w:tplc="08130001" w:tentative="1">
+      <w:start w:val="1"/>
+      <w:numFmt w:val="bullet"/>
+      <w:lvlText w:val=""/>
+      <w:lvlJc w:val="left"/>
+      <w:pPr>
+        <w:ind w:left="2880" w:hanging="360"/>
+      </w:pPr>
+      <w:rPr>
+        <w:rFonts w:ascii="Symbol" w:hAnsi="Symbol" w:hint="default"/>
+      </w:rPr>
+    </w:lvl>
+    <w:lvl w:ilvl="4" w:tplc="08130003" w:tentative="1">
+      <w:start w:val="1"/>
+      <w:numFmt w:val="bullet"/>
+      <w:lvlText w:val="o"/>
+      <w:lvlJc w:val="left"/>
+      <w:pPr>
+        <w:ind w:left="3600" w:hanging="360"/>
+      </w:pPr>
+      <w:rPr>
+        <w:rFonts w:ascii="Courier New" w:hAnsi="Courier New" w:cs="Courier New" w:hint="default"/>
+      </w:rPr>
+    </w:lvl>
+    <w:lvl w:ilvl="5" w:tplc="08130005" w:tentative="1">
+      <w:start w:val="1"/>
+      <w:numFmt w:val="bullet"/>
+      <w:lvlText w:val=""/>
+      <w:lvlJc w:val="left"/>
+      <w:pPr>
+        <w:ind w:left="4320" w:hanging="360"/>
+      </w:pPr>
+      <w:rPr>
+        <w:rFonts w:ascii="Wingdings" w:hAnsi="Wingdings" w:hint="default"/>
+      </w:rPr>
+    </w:lvl>
+    <w:lvl w:ilvl="6" w:tplc="08130001" w:tentative="1">
+      <w:start w:val="1"/>
+      <w:numFmt w:val="bullet"/>
+      <w:lvlText w:val=""/>
+      <w:lvlJc w:val="left"/>
+      <w:pPr>
+        <w:ind w:left="5040" w:hanging="360"/>
+      </w:pPr>
+      <w:rPr>
+        <w:rFonts w:ascii="Symbol" w:hAnsi="Symbol" w:hint="default"/>
+      </w:rPr>
+    </w:lvl>
+    <w:lvl w:ilvl="7" w:tplc="08130003" w:tentative="1">
+      <w:start w:val="1"/>
+      <w:numFmt w:val="bullet"/>
+      <w:lvlText w:val="o"/>
+      <w:lvlJc w:val="left"/>
+      <w:pPr>
+        <w:ind w:left="5760" w:hanging="360"/>
+      </w:pPr>
+      <w:rPr>
+        <w:rFonts w:ascii="Courier New" w:hAnsi="Courier New" w:cs="Courier New" w:hint="default"/>
+      </w:rPr>
+    </w:lvl>
+    <w:lvl w:ilvl="8" w:tplc="08130005" w:tentative="1">
+      <w:start w:val="1"/>
+      <w:numFmt w:val="bullet"/>
+      <w:lvlText w:val=""/>
+      <w:lvlJc w:val="left"/>
+      <w:pPr>
+        <w:ind w:left="6480" w:hanging="360"/>
+      </w:pPr>
+      <w:rPr>
+        <w:rFonts w:ascii="Wingdings" w:hAnsi="Wingdings" w:hint="default"/>
+      </w:rPr>
+    </w:lvl>
+  </w:abstractNum>
+  <w:abstractNum w:abstractNumId="1" w15:restartNumberingAfterBreak="0">
+    <w:nsid w:val="094A11B6"/>
+    <w:multiLevelType w:val="multilevel"/>
+    <w:tmpl w:val="2A0EE60E"/>
+    <w:lvl w:ilvl="0">
+      <w:start w:val="1"/>
+      <w:numFmt w:val="bullet"/>
+      <w:lvlText w:val=""/>
+      <w:lvlJc w:val="left"/>
+      <w:pPr>
+        <w:tabs>
+          <w:tab w:val="num" w:pos="720"/>
+        </w:tabs>
+        <w:ind w:left="720" w:hanging="360"/>
+      </w:pPr>
+      <w:rPr>
+        <w:rFonts w:ascii="Symbol" w:hAnsi="Symbol" w:hint="default"/>
+        <w:sz w:val="20"/>
+      </w:rPr>
+    </w:lvl>
+    <w:lvl w:ilvl="1" w:tentative="1">
+      <w:start w:val="1"/>
+      <w:numFmt w:val="bullet"/>
+      <w:lvlText w:val="o"/>
+      <w:lvlJc w:val="left"/>
+      <w:pPr>
+        <w:tabs>
+          <w:tab w:val="num" w:pos="1440"/>
+        </w:tabs>
+        <w:ind w:left="1440" w:hanging="360"/>
+      </w:pPr>
+      <w:rPr>
+        <w:rFonts w:ascii="Courier New" w:hAnsi="Courier New" w:hint="default"/>
+        <w:sz w:val="20"/>
+      </w:rPr>
+    </w:lvl>
+    <w:lvl w:ilvl="2" w:tentative="1">
+      <w:start w:val="1"/>
+      <w:numFmt w:val="bullet"/>
+      <w:lvlText w:val=""/>
+      <w:lvlJc w:val="left"/>
+      <w:pPr>
+        <w:tabs>
+          <w:tab w:val="num" w:pos="2160"/>
+        </w:tabs>
+        <w:ind w:left="2160" w:hanging="360"/>
+      </w:pPr>
+      <w:rPr>
+        <w:rFonts w:ascii="Wingdings" w:hAnsi="Wingdings" w:hint="default"/>
+        <w:sz w:val="20"/>
+      </w:rPr>
+    </w:lvl>
+    <w:lvl w:ilvl="3" w:tentative="1">
+      <w:start w:val="1"/>
+      <w:numFmt w:val="bullet"/>
+      <w:lvlText w:val=""/>
+      <w:lvlJc w:val="left"/>
+      <w:pPr>
+        <w:tabs>
+          <w:tab w:val="num" w:pos="2880"/>
+        </w:tabs>
+        <w:ind w:left="2880" w:hanging="360"/>
+      </w:pPr>
+      <w:rPr>
+        <w:rFonts w:ascii="Wingdings" w:hAnsi="Wingdings" w:hint="default"/>
+        <w:sz w:val="20"/>
+      </w:rPr>
+    </w:lvl>
+    <w:lvl w:ilvl="4" w:tentative="1">
+      <w:start w:val="1"/>
+      <w:numFmt w:val="bullet"/>
+      <w:lvlText w:val=""/>
+      <w:lvlJc w:val="left"/>
+      <w:pPr>
+        <w:tabs>
+          <w:tab w:val="num" w:pos="3600"/>
+        </w:tabs>
+        <w:ind w:left="3600" w:hanging="360"/>
+      </w:pPr>
+      <w:rPr>
+        <w:rFonts w:ascii="Wingdings" w:hAnsi="Wingdings" w:hint="default"/>
+        <w:sz w:val="20"/>
+      </w:rPr>
+    </w:lvl>
+    <w:lvl w:ilvl="5" w:tentative="1">
+      <w:start w:val="1"/>
+      <w:numFmt w:val="bullet"/>
+      <w:lvlText w:val=""/>
+      <w:lvlJc w:val="left"/>
+      <w:pPr>
+        <w:tabs>
+          <w:tab w:val="num" w:pos="4320"/>
+        </w:tabs>
+        <w:ind w:left="4320" w:hanging="360"/>
+      </w:pPr>
+      <w:rPr>
+        <w:rFonts w:ascii="Wingdings" w:hAnsi="Wingdings" w:hint="default"/>
+        <w:sz w:val="20"/>
+      </w:rPr>
+    </w:lvl>
+    <w:lvl w:ilvl="6" w:tentative="1">
+      <w:start w:val="1"/>
+      <w:numFmt w:val="bullet"/>
+      <w:lvlText w:val=""/>
+      <w:lvlJc w:val="left"/>
+      <w:pPr>
+        <w:tabs>
+          <w:tab w:val="num" w:pos="5040"/>
+        </w:tabs>
+        <w:ind w:left="5040" w:hanging="360"/>
+      </w:pPr>
+      <w:rPr>
+        <w:rFonts w:ascii="Wingdings" w:hAnsi="Wingdings" w:hint="default"/>
+        <w:sz w:val="20"/>
+      </w:rPr>
+    </w:lvl>
+    <w:lvl w:ilvl="7" w:tentative="1">
+      <w:start w:val="1"/>
+      <w:numFmt w:val="bullet"/>
+      <w:lvlText w:val=""/>
+      <w:lvlJc w:val="left"/>
+      <w:pPr>
+        <w:tabs>
+          <w:tab w:val="num" w:pos="5760"/>
+        </w:tabs>
+        <w:ind w:left="5760" w:hanging="360"/>
+      </w:pPr>
+      <w:rPr>
+        <w:rFonts w:ascii="Wingdings" w:hAnsi="Wingdings" w:hint="default"/>
+        <w:sz w:val="20"/>
+      </w:rPr>
+    </w:lvl>
+    <w:lvl w:ilvl="8" w:tentative="1">
+      <w:start w:val="1"/>
+      <w:numFmt w:val="bullet"/>
+      <w:lvlText w:val=""/>
+      <w:lvlJc w:val="left"/>
+      <w:pPr>
+        <w:tabs>
+          <w:tab w:val="num" w:pos="6480"/>
+        </w:tabs>
+        <w:ind w:left="6480" w:hanging="360"/>
+      </w:pPr>
+      <w:rPr>
+        <w:rFonts w:ascii="Wingdings" w:hAnsi="Wingdings" w:hint="default"/>
+        <w:sz w:val="20"/>
+      </w:rPr>
+    </w:lvl>
+  </w:abstractNum>
+  <w:abstractNum w:abstractNumId="2" w15:restartNumberingAfterBreak="0">
     <w:nsid w:val="0D4D083D"/>
     <w:multiLevelType w:val="hybridMultilevel"/>
     <w:tmpl w:val="E834C53E"/>
@@ -957,7 +1765,870 @@
       </w:rPr>
     </w:lvl>
   </w:abstractNum>
-  <w:abstractNum w:abstractNumId="1" w15:restartNumberingAfterBreak="0">
+  <w:abstractNum w:abstractNumId="3" w15:restartNumberingAfterBreak="0">
+    <w:nsid w:val="29EC7C3D"/>
+    <w:multiLevelType w:val="hybridMultilevel"/>
+    <w:tmpl w:val="0A98DA00"/>
+    <w:lvl w:ilvl="0" w:tplc="08130001">
+      <w:start w:val="1"/>
+      <w:numFmt w:val="bullet"/>
+      <w:lvlText w:val=""/>
+      <w:lvlJc w:val="left"/>
+      <w:pPr>
+        <w:ind w:left="720" w:hanging="360"/>
+      </w:pPr>
+      <w:rPr>
+        <w:rFonts w:ascii="Symbol" w:hAnsi="Symbol" w:hint="default"/>
+      </w:rPr>
+    </w:lvl>
+    <w:lvl w:ilvl="1" w:tplc="08130003">
+      <w:start w:val="1"/>
+      <w:numFmt w:val="bullet"/>
+      <w:lvlText w:val="o"/>
+      <w:lvlJc w:val="left"/>
+      <w:pPr>
+        <w:ind w:left="1440" w:hanging="360"/>
+      </w:pPr>
+      <w:rPr>
+        <w:rFonts w:ascii="Courier New" w:hAnsi="Courier New" w:cs="Courier New" w:hint="default"/>
+      </w:rPr>
+    </w:lvl>
+    <w:lvl w:ilvl="2" w:tplc="08130005">
+      <w:start w:val="1"/>
+      <w:numFmt w:val="bullet"/>
+      <w:lvlText w:val=""/>
+      <w:lvlJc w:val="left"/>
+      <w:pPr>
+        <w:ind w:left="2160" w:hanging="360"/>
+      </w:pPr>
+      <w:rPr>
+        <w:rFonts w:ascii="Wingdings" w:hAnsi="Wingdings" w:hint="default"/>
+      </w:rPr>
+    </w:lvl>
+    <w:lvl w:ilvl="3" w:tplc="08130001" w:tentative="1">
+      <w:start w:val="1"/>
+      <w:numFmt w:val="bullet"/>
+      <w:lvlText w:val=""/>
+      <w:lvlJc w:val="left"/>
+      <w:pPr>
+        <w:ind w:left="2880" w:hanging="360"/>
+      </w:pPr>
+      <w:rPr>
+        <w:rFonts w:ascii="Symbol" w:hAnsi="Symbol" w:hint="default"/>
+      </w:rPr>
+    </w:lvl>
+    <w:lvl w:ilvl="4" w:tplc="08130003" w:tentative="1">
+      <w:start w:val="1"/>
+      <w:numFmt w:val="bullet"/>
+      <w:lvlText w:val="o"/>
+      <w:lvlJc w:val="left"/>
+      <w:pPr>
+        <w:ind w:left="3600" w:hanging="360"/>
+      </w:pPr>
+      <w:rPr>
+        <w:rFonts w:ascii="Courier New" w:hAnsi="Courier New" w:cs="Courier New" w:hint="default"/>
+      </w:rPr>
+    </w:lvl>
+    <w:lvl w:ilvl="5" w:tplc="08130005" w:tentative="1">
+      <w:start w:val="1"/>
+      <w:numFmt w:val="bullet"/>
+      <w:lvlText w:val=""/>
+      <w:lvlJc w:val="left"/>
+      <w:pPr>
+        <w:ind w:left="4320" w:hanging="360"/>
+      </w:pPr>
+      <w:rPr>
+        <w:rFonts w:ascii="Wingdings" w:hAnsi="Wingdings" w:hint="default"/>
+      </w:rPr>
+    </w:lvl>
+    <w:lvl w:ilvl="6" w:tplc="08130001" w:tentative="1">
+      <w:start w:val="1"/>
+      <w:numFmt w:val="bullet"/>
+      <w:lvlText w:val=""/>
+      <w:lvlJc w:val="left"/>
+      <w:pPr>
+        <w:ind w:left="5040" w:hanging="360"/>
+      </w:pPr>
+      <w:rPr>
+        <w:rFonts w:ascii="Symbol" w:hAnsi="Symbol" w:hint="default"/>
+      </w:rPr>
+    </w:lvl>
+    <w:lvl w:ilvl="7" w:tplc="08130003" w:tentative="1">
+      <w:start w:val="1"/>
+      <w:numFmt w:val="bullet"/>
+      <w:lvlText w:val="o"/>
+      <w:lvlJc w:val="left"/>
+      <w:pPr>
+        <w:ind w:left="5760" w:hanging="360"/>
+      </w:pPr>
+      <w:rPr>
+        <w:rFonts w:ascii="Courier New" w:hAnsi="Courier New" w:cs="Courier New" w:hint="default"/>
+      </w:rPr>
+    </w:lvl>
+    <w:lvl w:ilvl="8" w:tplc="08130005" w:tentative="1">
+      <w:start w:val="1"/>
+      <w:numFmt w:val="bullet"/>
+      <w:lvlText w:val=""/>
+      <w:lvlJc w:val="left"/>
+      <w:pPr>
+        <w:ind w:left="6480" w:hanging="360"/>
+      </w:pPr>
+      <w:rPr>
+        <w:rFonts w:ascii="Wingdings" w:hAnsi="Wingdings" w:hint="default"/>
+      </w:rPr>
+    </w:lvl>
+  </w:abstractNum>
+  <w:abstractNum w:abstractNumId="4" w15:restartNumberingAfterBreak="0">
+    <w:nsid w:val="3AED44D5"/>
+    <w:multiLevelType w:val="hybridMultilevel"/>
+    <w:tmpl w:val="B04858A4"/>
+    <w:lvl w:ilvl="0" w:tplc="08130001">
+      <w:start w:val="1"/>
+      <w:numFmt w:val="bullet"/>
+      <w:lvlText w:val=""/>
+      <w:lvlJc w:val="left"/>
+      <w:pPr>
+        <w:ind w:left="720" w:hanging="360"/>
+      </w:pPr>
+      <w:rPr>
+        <w:rFonts w:ascii="Symbol" w:hAnsi="Symbol" w:hint="default"/>
+      </w:rPr>
+    </w:lvl>
+    <w:lvl w:ilvl="1" w:tplc="08130003">
+      <w:start w:val="1"/>
+      <w:numFmt w:val="bullet"/>
+      <w:lvlText w:val="o"/>
+      <w:lvlJc w:val="left"/>
+      <w:pPr>
+        <w:ind w:left="1440" w:hanging="360"/>
+      </w:pPr>
+      <w:rPr>
+        <w:rFonts w:ascii="Courier New" w:hAnsi="Courier New" w:cs="Courier New" w:hint="default"/>
+      </w:rPr>
+    </w:lvl>
+    <w:lvl w:ilvl="2" w:tplc="08130005">
+      <w:start w:val="1"/>
+      <w:numFmt w:val="bullet"/>
+      <w:lvlText w:val=""/>
+      <w:lvlJc w:val="left"/>
+      <w:pPr>
+        <w:ind w:left="2160" w:hanging="360"/>
+      </w:pPr>
+      <w:rPr>
+        <w:rFonts w:ascii="Wingdings" w:hAnsi="Wingdings" w:hint="default"/>
+      </w:rPr>
+    </w:lvl>
+    <w:lvl w:ilvl="3" w:tplc="08130001" w:tentative="1">
+      <w:start w:val="1"/>
+      <w:numFmt w:val="bullet"/>
+      <w:lvlText w:val=""/>
+      <w:lvlJc w:val="left"/>
+      <w:pPr>
+        <w:ind w:left="2880" w:hanging="360"/>
+      </w:pPr>
+      <w:rPr>
+        <w:rFonts w:ascii="Symbol" w:hAnsi="Symbol" w:hint="default"/>
+      </w:rPr>
+    </w:lvl>
+    <w:lvl w:ilvl="4" w:tplc="08130003" w:tentative="1">
+      <w:start w:val="1"/>
+      <w:numFmt w:val="bullet"/>
+      <w:lvlText w:val="o"/>
+      <w:lvlJc w:val="left"/>
+      <w:pPr>
+        <w:ind w:left="3600" w:hanging="360"/>
+      </w:pPr>
+      <w:rPr>
+        <w:rFonts w:ascii="Courier New" w:hAnsi="Courier New" w:cs="Courier New" w:hint="default"/>
+      </w:rPr>
+    </w:lvl>
+    <w:lvl w:ilvl="5" w:tplc="08130005" w:tentative="1">
+      <w:start w:val="1"/>
+      <w:numFmt w:val="bullet"/>
+      <w:lvlText w:val=""/>
+      <w:lvlJc w:val="left"/>
+      <w:pPr>
+        <w:ind w:left="4320" w:hanging="360"/>
+      </w:pPr>
+      <w:rPr>
+        <w:rFonts w:ascii="Wingdings" w:hAnsi="Wingdings" w:hint="default"/>
+      </w:rPr>
+    </w:lvl>
+    <w:lvl w:ilvl="6" w:tplc="08130001" w:tentative="1">
+      <w:start w:val="1"/>
+      <w:numFmt w:val="bullet"/>
+      <w:lvlText w:val=""/>
+      <w:lvlJc w:val="left"/>
+      <w:pPr>
+        <w:ind w:left="5040" w:hanging="360"/>
+      </w:pPr>
+      <w:rPr>
+        <w:rFonts w:ascii="Symbol" w:hAnsi="Symbol" w:hint="default"/>
+      </w:rPr>
+    </w:lvl>
+    <w:lvl w:ilvl="7" w:tplc="08130003" w:tentative="1">
+      <w:start w:val="1"/>
+      <w:numFmt w:val="bullet"/>
+      <w:lvlText w:val="o"/>
+      <w:lvlJc w:val="left"/>
+      <w:pPr>
+        <w:ind w:left="5760" w:hanging="360"/>
+      </w:pPr>
+      <w:rPr>
+        <w:rFonts w:ascii="Courier New" w:hAnsi="Courier New" w:cs="Courier New" w:hint="default"/>
+      </w:rPr>
+    </w:lvl>
+    <w:lvl w:ilvl="8" w:tplc="08130005" w:tentative="1">
+      <w:start w:val="1"/>
+      <w:numFmt w:val="bullet"/>
+      <w:lvlText w:val=""/>
+      <w:lvlJc w:val="left"/>
+      <w:pPr>
+        <w:ind w:left="6480" w:hanging="360"/>
+      </w:pPr>
+      <w:rPr>
+        <w:rFonts w:ascii="Wingdings" w:hAnsi="Wingdings" w:hint="default"/>
+      </w:rPr>
+    </w:lvl>
+  </w:abstractNum>
+  <w:abstractNum w:abstractNumId="5" w15:restartNumberingAfterBreak="0">
+    <w:nsid w:val="41273415"/>
+    <w:multiLevelType w:val="hybridMultilevel"/>
+    <w:tmpl w:val="76F62902"/>
+    <w:lvl w:ilvl="0" w:tplc="08130001">
+      <w:start w:val="1"/>
+      <w:numFmt w:val="bullet"/>
+      <w:lvlText w:val=""/>
+      <w:lvlJc w:val="left"/>
+      <w:pPr>
+        <w:ind w:left="720" w:hanging="360"/>
+      </w:pPr>
+      <w:rPr>
+        <w:rFonts w:ascii="Symbol" w:hAnsi="Symbol" w:hint="default"/>
+      </w:rPr>
+    </w:lvl>
+    <w:lvl w:ilvl="1" w:tplc="08130003">
+      <w:start w:val="1"/>
+      <w:numFmt w:val="bullet"/>
+      <w:lvlText w:val="o"/>
+      <w:lvlJc w:val="left"/>
+      <w:pPr>
+        <w:ind w:left="1440" w:hanging="360"/>
+      </w:pPr>
+      <w:rPr>
+        <w:rFonts w:ascii="Courier New" w:hAnsi="Courier New" w:cs="Courier New" w:hint="default"/>
+      </w:rPr>
+    </w:lvl>
+    <w:lvl w:ilvl="2" w:tplc="08130005">
+      <w:start w:val="1"/>
+      <w:numFmt w:val="bullet"/>
+      <w:lvlText w:val=""/>
+      <w:lvlJc w:val="left"/>
+      <w:pPr>
+        <w:ind w:left="2160" w:hanging="360"/>
+      </w:pPr>
+      <w:rPr>
+        <w:rFonts w:ascii="Wingdings" w:hAnsi="Wingdings" w:hint="default"/>
+      </w:rPr>
+    </w:lvl>
+    <w:lvl w:ilvl="3" w:tplc="08130001" w:tentative="1">
+      <w:start w:val="1"/>
+      <w:numFmt w:val="bullet"/>
+      <w:lvlText w:val=""/>
+      <w:lvlJc w:val="left"/>
+      <w:pPr>
+        <w:ind w:left="2880" w:hanging="360"/>
+      </w:pPr>
+      <w:rPr>
+        <w:rFonts w:ascii="Symbol" w:hAnsi="Symbol" w:hint="default"/>
+      </w:rPr>
+    </w:lvl>
+    <w:lvl w:ilvl="4" w:tplc="08130003" w:tentative="1">
+      <w:start w:val="1"/>
+      <w:numFmt w:val="bullet"/>
+      <w:lvlText w:val="o"/>
+      <w:lvlJc w:val="left"/>
+      <w:pPr>
+        <w:ind w:left="3600" w:hanging="360"/>
+      </w:pPr>
+      <w:rPr>
+        <w:rFonts w:ascii="Courier New" w:hAnsi="Courier New" w:cs="Courier New" w:hint="default"/>
+      </w:rPr>
+    </w:lvl>
+    <w:lvl w:ilvl="5" w:tplc="08130005" w:tentative="1">
+      <w:start w:val="1"/>
+      <w:numFmt w:val="bullet"/>
+      <w:lvlText w:val=""/>
+      <w:lvlJc w:val="left"/>
+      <w:pPr>
+        <w:ind w:left="4320" w:hanging="360"/>
+      </w:pPr>
+      <w:rPr>
+        <w:rFonts w:ascii="Wingdings" w:hAnsi="Wingdings" w:hint="default"/>
+      </w:rPr>
+    </w:lvl>
+    <w:lvl w:ilvl="6" w:tplc="08130001" w:tentative="1">
+      <w:start w:val="1"/>
+      <w:numFmt w:val="bullet"/>
+      <w:lvlText w:val=""/>
+      <w:lvlJc w:val="left"/>
+      <w:pPr>
+        <w:ind w:left="5040" w:hanging="360"/>
+      </w:pPr>
+      <w:rPr>
+        <w:rFonts w:ascii="Symbol" w:hAnsi="Symbol" w:hint="default"/>
+      </w:rPr>
+    </w:lvl>
+    <w:lvl w:ilvl="7" w:tplc="08130003" w:tentative="1">
+      <w:start w:val="1"/>
+      <w:numFmt w:val="bullet"/>
+      <w:lvlText w:val="o"/>
+      <w:lvlJc w:val="left"/>
+      <w:pPr>
+        <w:ind w:left="5760" w:hanging="360"/>
+      </w:pPr>
+      <w:rPr>
+        <w:rFonts w:ascii="Courier New" w:hAnsi="Courier New" w:cs="Courier New" w:hint="default"/>
+      </w:rPr>
+    </w:lvl>
+    <w:lvl w:ilvl="8" w:tplc="08130005" w:tentative="1">
+      <w:start w:val="1"/>
+      <w:numFmt w:val="bullet"/>
+      <w:lvlText w:val=""/>
+      <w:lvlJc w:val="left"/>
+      <w:pPr>
+        <w:ind w:left="6480" w:hanging="360"/>
+      </w:pPr>
+      <w:rPr>
+        <w:rFonts w:ascii="Wingdings" w:hAnsi="Wingdings" w:hint="default"/>
+      </w:rPr>
+    </w:lvl>
+  </w:abstractNum>
+  <w:abstractNum w:abstractNumId="6" w15:restartNumberingAfterBreak="0">
+    <w:nsid w:val="55695372"/>
+    <w:multiLevelType w:val="hybridMultilevel"/>
+    <w:tmpl w:val="1B2E2DA8"/>
+    <w:lvl w:ilvl="0" w:tplc="08130001">
+      <w:start w:val="1"/>
+      <w:numFmt w:val="bullet"/>
+      <w:lvlText w:val=""/>
+      <w:lvlJc w:val="left"/>
+      <w:pPr>
+        <w:ind w:left="720" w:hanging="360"/>
+      </w:pPr>
+      <w:rPr>
+        <w:rFonts w:ascii="Symbol" w:hAnsi="Symbol" w:hint="default"/>
+      </w:rPr>
+    </w:lvl>
+    <w:lvl w:ilvl="1" w:tplc="08130003">
+      <w:start w:val="1"/>
+      <w:numFmt w:val="bullet"/>
+      <w:lvlText w:val="o"/>
+      <w:lvlJc w:val="left"/>
+      <w:pPr>
+        <w:ind w:left="1440" w:hanging="360"/>
+      </w:pPr>
+      <w:rPr>
+        <w:rFonts w:ascii="Courier New" w:hAnsi="Courier New" w:cs="Courier New" w:hint="default"/>
+      </w:rPr>
+    </w:lvl>
+    <w:lvl w:ilvl="2" w:tplc="08130005">
+      <w:start w:val="1"/>
+      <w:numFmt w:val="bullet"/>
+      <w:lvlText w:val=""/>
+      <w:lvlJc w:val="left"/>
+      <w:pPr>
+        <w:ind w:left="2160" w:hanging="360"/>
+      </w:pPr>
+      <w:rPr>
+        <w:rFonts w:ascii="Wingdings" w:hAnsi="Wingdings" w:hint="default"/>
+      </w:rPr>
+    </w:lvl>
+    <w:lvl w:ilvl="3" w:tplc="08130001" w:tentative="1">
+      <w:start w:val="1"/>
+      <w:numFmt w:val="bullet"/>
+      <w:lvlText w:val=""/>
+      <w:lvlJc w:val="left"/>
+      <w:pPr>
+        <w:ind w:left="2880" w:hanging="360"/>
+      </w:pPr>
+      <w:rPr>
+        <w:rFonts w:ascii="Symbol" w:hAnsi="Symbol" w:hint="default"/>
+      </w:rPr>
+    </w:lvl>
+    <w:lvl w:ilvl="4" w:tplc="08130003" w:tentative="1">
+      <w:start w:val="1"/>
+      <w:numFmt w:val="bullet"/>
+      <w:lvlText w:val="o"/>
+      <w:lvlJc w:val="left"/>
+      <w:pPr>
+        <w:ind w:left="3600" w:hanging="360"/>
+      </w:pPr>
+      <w:rPr>
+        <w:rFonts w:ascii="Courier New" w:hAnsi="Courier New" w:cs="Courier New" w:hint="default"/>
+      </w:rPr>
+    </w:lvl>
+    <w:lvl w:ilvl="5" w:tplc="08130005" w:tentative="1">
+      <w:start w:val="1"/>
+      <w:numFmt w:val="bullet"/>
+      <w:lvlText w:val=""/>
+      <w:lvlJc w:val="left"/>
+      <w:pPr>
+        <w:ind w:left="4320" w:hanging="360"/>
+      </w:pPr>
+      <w:rPr>
+        <w:rFonts w:ascii="Wingdings" w:hAnsi="Wingdings" w:hint="default"/>
+      </w:rPr>
+    </w:lvl>
+    <w:lvl w:ilvl="6" w:tplc="08130001" w:tentative="1">
+      <w:start w:val="1"/>
+      <w:numFmt w:val="bullet"/>
+      <w:lvlText w:val=""/>
+      <w:lvlJc w:val="left"/>
+      <w:pPr>
+        <w:ind w:left="5040" w:hanging="360"/>
+      </w:pPr>
+      <w:rPr>
+        <w:rFonts w:ascii="Symbol" w:hAnsi="Symbol" w:hint="default"/>
+      </w:rPr>
+    </w:lvl>
+    <w:lvl w:ilvl="7" w:tplc="08130003" w:tentative="1">
+      <w:start w:val="1"/>
+      <w:numFmt w:val="bullet"/>
+      <w:lvlText w:val="o"/>
+      <w:lvlJc w:val="left"/>
+      <w:pPr>
+        <w:ind w:left="5760" w:hanging="360"/>
+      </w:pPr>
+      <w:rPr>
+        <w:rFonts w:ascii="Courier New" w:hAnsi="Courier New" w:cs="Courier New" w:hint="default"/>
+      </w:rPr>
+    </w:lvl>
+    <w:lvl w:ilvl="8" w:tplc="08130005" w:tentative="1">
+      <w:start w:val="1"/>
+      <w:numFmt w:val="bullet"/>
+      <w:lvlText w:val=""/>
+      <w:lvlJc w:val="left"/>
+      <w:pPr>
+        <w:ind w:left="6480" w:hanging="360"/>
+      </w:pPr>
+      <w:rPr>
+        <w:rFonts w:ascii="Wingdings" w:hAnsi="Wingdings" w:hint="default"/>
+      </w:rPr>
+    </w:lvl>
+  </w:abstractNum>
+  <w:abstractNum w:abstractNumId="7" w15:restartNumberingAfterBreak="0">
+    <w:nsid w:val="5EDA1EF4"/>
+    <w:multiLevelType w:val="hybridMultilevel"/>
+    <w:tmpl w:val="77825B94"/>
+    <w:lvl w:ilvl="0" w:tplc="08130001">
+      <w:start w:val="1"/>
+      <w:numFmt w:val="bullet"/>
+      <w:lvlText w:val=""/>
+      <w:lvlJc w:val="left"/>
+      <w:pPr>
+        <w:ind w:left="720" w:hanging="360"/>
+      </w:pPr>
+      <w:rPr>
+        <w:rFonts w:ascii="Symbol" w:hAnsi="Symbol" w:hint="default"/>
+      </w:rPr>
+    </w:lvl>
+    <w:lvl w:ilvl="1" w:tplc="08130003">
+      <w:start w:val="1"/>
+      <w:numFmt w:val="bullet"/>
+      <w:lvlText w:val="o"/>
+      <w:lvlJc w:val="left"/>
+      <w:pPr>
+        <w:ind w:left="1440" w:hanging="360"/>
+      </w:pPr>
+      <w:rPr>
+        <w:rFonts w:ascii="Courier New" w:hAnsi="Courier New" w:cs="Courier New" w:hint="default"/>
+      </w:rPr>
+    </w:lvl>
+    <w:lvl w:ilvl="2" w:tplc="08130005">
+      <w:start w:val="1"/>
+      <w:numFmt w:val="bullet"/>
+      <w:lvlText w:val=""/>
+      <w:lvlJc w:val="left"/>
+      <w:pPr>
+        <w:ind w:left="2160" w:hanging="360"/>
+      </w:pPr>
+      <w:rPr>
+        <w:rFonts w:ascii="Wingdings" w:hAnsi="Wingdings" w:hint="default"/>
+      </w:rPr>
+    </w:lvl>
+    <w:lvl w:ilvl="3" w:tplc="08130001" w:tentative="1">
+      <w:start w:val="1"/>
+      <w:numFmt w:val="bullet"/>
+      <w:lvlText w:val=""/>
+      <w:lvlJc w:val="left"/>
+      <w:pPr>
+        <w:ind w:left="2880" w:hanging="360"/>
+      </w:pPr>
+      <w:rPr>
+        <w:rFonts w:ascii="Symbol" w:hAnsi="Symbol" w:hint="default"/>
+      </w:rPr>
+    </w:lvl>
+    <w:lvl w:ilvl="4" w:tplc="08130003" w:tentative="1">
+      <w:start w:val="1"/>
+      <w:numFmt w:val="bullet"/>
+      <w:lvlText w:val="o"/>
+      <w:lvlJc w:val="left"/>
+      <w:pPr>
+        <w:ind w:left="3600" w:hanging="360"/>
+      </w:pPr>
+      <w:rPr>
+        <w:rFonts w:ascii="Courier New" w:hAnsi="Courier New" w:cs="Courier New" w:hint="default"/>
+      </w:rPr>
+    </w:lvl>
+    <w:lvl w:ilvl="5" w:tplc="08130005" w:tentative="1">
+      <w:start w:val="1"/>
+      <w:numFmt w:val="bullet"/>
+      <w:lvlText w:val=""/>
+      <w:lvlJc w:val="left"/>
+      <w:pPr>
+        <w:ind w:left="4320" w:hanging="360"/>
+      </w:pPr>
+      <w:rPr>
+        <w:rFonts w:ascii="Wingdings" w:hAnsi="Wingdings" w:hint="default"/>
+      </w:rPr>
+    </w:lvl>
+    <w:lvl w:ilvl="6" w:tplc="08130001" w:tentative="1">
+      <w:start w:val="1"/>
+      <w:numFmt w:val="bullet"/>
+      <w:lvlText w:val=""/>
+      <w:lvlJc w:val="left"/>
+      <w:pPr>
+        <w:ind w:left="5040" w:hanging="360"/>
+      </w:pPr>
+      <w:rPr>
+        <w:rFonts w:ascii="Symbol" w:hAnsi="Symbol" w:hint="default"/>
+      </w:rPr>
+    </w:lvl>
+    <w:lvl w:ilvl="7" w:tplc="08130003" w:tentative="1">
+      <w:start w:val="1"/>
+      <w:numFmt w:val="bullet"/>
+      <w:lvlText w:val="o"/>
+      <w:lvlJc w:val="left"/>
+      <w:pPr>
+        <w:ind w:left="5760" w:hanging="360"/>
+      </w:pPr>
+      <w:rPr>
+        <w:rFonts w:ascii="Courier New" w:hAnsi="Courier New" w:cs="Courier New" w:hint="default"/>
+      </w:rPr>
+    </w:lvl>
+    <w:lvl w:ilvl="8" w:tplc="08130005" w:tentative="1">
+      <w:start w:val="1"/>
+      <w:numFmt w:val="bullet"/>
+      <w:lvlText w:val=""/>
+      <w:lvlJc w:val="left"/>
+      <w:pPr>
+        <w:ind w:left="6480" w:hanging="360"/>
+      </w:pPr>
+      <w:rPr>
+        <w:rFonts w:ascii="Wingdings" w:hAnsi="Wingdings" w:hint="default"/>
+      </w:rPr>
+    </w:lvl>
+  </w:abstractNum>
+  <w:abstractNum w:abstractNumId="8" w15:restartNumberingAfterBreak="0">
+    <w:nsid w:val="67074711"/>
+    <w:multiLevelType w:val="multilevel"/>
+    <w:tmpl w:val="2BEED2C8"/>
+    <w:lvl w:ilvl="0">
+      <w:start w:val="1"/>
+      <w:numFmt w:val="bullet"/>
+      <w:lvlText w:val=""/>
+      <w:lvlJc w:val="left"/>
+      <w:pPr>
+        <w:tabs>
+          <w:tab w:val="num" w:pos="720"/>
+        </w:tabs>
+        <w:ind w:left="720" w:hanging="360"/>
+      </w:pPr>
+      <w:rPr>
+        <w:rFonts w:ascii="Symbol" w:hAnsi="Symbol" w:hint="default"/>
+        <w:sz w:val="20"/>
+      </w:rPr>
+    </w:lvl>
+    <w:lvl w:ilvl="1" w:tentative="1">
+      <w:start w:val="1"/>
+      <w:numFmt w:val="bullet"/>
+      <w:lvlText w:val="o"/>
+      <w:lvlJc w:val="left"/>
+      <w:pPr>
+        <w:tabs>
+          <w:tab w:val="num" w:pos="1440"/>
+        </w:tabs>
+        <w:ind w:left="1440" w:hanging="360"/>
+      </w:pPr>
+      <w:rPr>
+        <w:rFonts w:ascii="Courier New" w:hAnsi="Courier New" w:hint="default"/>
+        <w:sz w:val="20"/>
+      </w:rPr>
+    </w:lvl>
+    <w:lvl w:ilvl="2" w:tentative="1">
+      <w:start w:val="1"/>
+      <w:numFmt w:val="bullet"/>
+      <w:lvlText w:val=""/>
+      <w:lvlJc w:val="left"/>
+      <w:pPr>
+        <w:tabs>
+          <w:tab w:val="num" w:pos="2160"/>
+        </w:tabs>
+        <w:ind w:left="2160" w:hanging="360"/>
+      </w:pPr>
+      <w:rPr>
+        <w:rFonts w:ascii="Wingdings" w:hAnsi="Wingdings" w:hint="default"/>
+        <w:sz w:val="20"/>
+      </w:rPr>
+    </w:lvl>
+    <w:lvl w:ilvl="3" w:tentative="1">
+      <w:start w:val="1"/>
+      <w:numFmt w:val="bullet"/>
+      <w:lvlText w:val=""/>
+      <w:lvlJc w:val="left"/>
+      <w:pPr>
+        <w:tabs>
+          <w:tab w:val="num" w:pos="2880"/>
+        </w:tabs>
+        <w:ind w:left="2880" w:hanging="360"/>
+      </w:pPr>
+      <w:rPr>
+        <w:rFonts w:ascii="Wingdings" w:hAnsi="Wingdings" w:hint="default"/>
+        <w:sz w:val="20"/>
+      </w:rPr>
+    </w:lvl>
+    <w:lvl w:ilvl="4" w:tentative="1">
+      <w:start w:val="1"/>
+      <w:numFmt w:val="bullet"/>
+      <w:lvlText w:val=""/>
+      <w:lvlJc w:val="left"/>
+      <w:pPr>
+        <w:tabs>
+          <w:tab w:val="num" w:pos="3600"/>
+        </w:tabs>
+        <w:ind w:left="3600" w:hanging="360"/>
+      </w:pPr>
+      <w:rPr>
+        <w:rFonts w:ascii="Wingdings" w:hAnsi="Wingdings" w:hint="default"/>
+        <w:sz w:val="20"/>
+      </w:rPr>
+    </w:lvl>
+    <w:lvl w:ilvl="5" w:tentative="1">
+      <w:start w:val="1"/>
+      <w:numFmt w:val="bullet"/>
+      <w:lvlText w:val=""/>
+      <w:lvlJc w:val="left"/>
+      <w:pPr>
+        <w:tabs>
+          <w:tab w:val="num" w:pos="4320"/>
+        </w:tabs>
+        <w:ind w:left="4320" w:hanging="360"/>
+      </w:pPr>
+      <w:rPr>
+        <w:rFonts w:ascii="Wingdings" w:hAnsi="Wingdings" w:hint="default"/>
+        <w:sz w:val="20"/>
+      </w:rPr>
+    </w:lvl>
+    <w:lvl w:ilvl="6" w:tentative="1">
+      <w:start w:val="1"/>
+      <w:numFmt w:val="bullet"/>
+      <w:lvlText w:val=""/>
+      <w:lvlJc w:val="left"/>
+      <w:pPr>
+        <w:tabs>
+          <w:tab w:val="num" w:pos="5040"/>
+        </w:tabs>
+        <w:ind w:left="5040" w:hanging="360"/>
+      </w:pPr>
+      <w:rPr>
+        <w:rFonts w:ascii="Wingdings" w:hAnsi="Wingdings" w:hint="default"/>
+        <w:sz w:val="20"/>
+      </w:rPr>
+    </w:lvl>
+    <w:lvl w:ilvl="7" w:tentative="1">
+      <w:start w:val="1"/>
+      <w:numFmt w:val="bullet"/>
+      <w:lvlText w:val=""/>
+      <w:lvlJc w:val="left"/>
+      <w:pPr>
+        <w:tabs>
+          <w:tab w:val="num" w:pos="5760"/>
+        </w:tabs>
+        <w:ind w:left="5760" w:hanging="360"/>
+      </w:pPr>
+      <w:rPr>
+        <w:rFonts w:ascii="Wingdings" w:hAnsi="Wingdings" w:hint="default"/>
+        <w:sz w:val="20"/>
+      </w:rPr>
+    </w:lvl>
+    <w:lvl w:ilvl="8" w:tentative="1">
+      <w:start w:val="1"/>
+      <w:numFmt w:val="bullet"/>
+      <w:lvlText w:val=""/>
+      <w:lvlJc w:val="left"/>
+      <w:pPr>
+        <w:tabs>
+          <w:tab w:val="num" w:pos="6480"/>
+        </w:tabs>
+        <w:ind w:left="6480" w:hanging="360"/>
+      </w:pPr>
+      <w:rPr>
+        <w:rFonts w:ascii="Wingdings" w:hAnsi="Wingdings" w:hint="default"/>
+        <w:sz w:val="20"/>
+      </w:rPr>
+    </w:lvl>
+  </w:abstractNum>
+  <w:abstractNum w:abstractNumId="9" w15:restartNumberingAfterBreak="0">
+    <w:nsid w:val="6A1F6709"/>
+    <w:multiLevelType w:val="multilevel"/>
+    <w:tmpl w:val="254E8530"/>
+    <w:lvl w:ilvl="0">
+      <w:start w:val="1"/>
+      <w:numFmt w:val="bullet"/>
+      <w:lvlText w:val=""/>
+      <w:lvlJc w:val="left"/>
+      <w:pPr>
+        <w:tabs>
+          <w:tab w:val="num" w:pos="720"/>
+        </w:tabs>
+        <w:ind w:left="720" w:hanging="360"/>
+      </w:pPr>
+      <w:rPr>
+        <w:rFonts w:ascii="Symbol" w:hAnsi="Symbol" w:hint="default"/>
+        <w:sz w:val="20"/>
+      </w:rPr>
+    </w:lvl>
+    <w:lvl w:ilvl="1" w:tentative="1">
+      <w:start w:val="1"/>
+      <w:numFmt w:val="bullet"/>
+      <w:lvlText w:val="o"/>
+      <w:lvlJc w:val="left"/>
+      <w:pPr>
+        <w:tabs>
+          <w:tab w:val="num" w:pos="1440"/>
+        </w:tabs>
+        <w:ind w:left="1440" w:hanging="360"/>
+      </w:pPr>
+      <w:rPr>
+        <w:rFonts w:ascii="Courier New" w:hAnsi="Courier New" w:hint="default"/>
+        <w:sz w:val="20"/>
+      </w:rPr>
+    </w:lvl>
+    <w:lvl w:ilvl="2" w:tentative="1">
+      <w:start w:val="1"/>
+      <w:numFmt w:val="bullet"/>
+      <w:lvlText w:val=""/>
+      <w:lvlJc w:val="left"/>
+      <w:pPr>
+        <w:tabs>
+          <w:tab w:val="num" w:pos="2160"/>
+        </w:tabs>
+        <w:ind w:left="2160" w:hanging="360"/>
+      </w:pPr>
+      <w:rPr>
+        <w:rFonts w:ascii="Wingdings" w:hAnsi="Wingdings" w:hint="default"/>
+        <w:sz w:val="20"/>
+      </w:rPr>
+    </w:lvl>
+    <w:lvl w:ilvl="3" w:tentative="1">
+      <w:start w:val="1"/>
+      <w:numFmt w:val="bullet"/>
+      <w:lvlText w:val=""/>
+      <w:lvlJc w:val="left"/>
+      <w:pPr>
+        <w:tabs>
+          <w:tab w:val="num" w:pos="2880"/>
+        </w:tabs>
+        <w:ind w:left="2880" w:hanging="360"/>
+      </w:pPr>
+      <w:rPr>
+        <w:rFonts w:ascii="Wingdings" w:hAnsi="Wingdings" w:hint="default"/>
+        <w:sz w:val="20"/>
+      </w:rPr>
+    </w:lvl>
+    <w:lvl w:ilvl="4" w:tentative="1">
+      <w:start w:val="1"/>
+      <w:numFmt w:val="bullet"/>
+      <w:lvlText w:val=""/>
+      <w:lvlJc w:val="left"/>
+      <w:pPr>
+        <w:tabs>
+          <w:tab w:val="num" w:pos="3600"/>
+        </w:tabs>
+        <w:ind w:left="3600" w:hanging="360"/>
+      </w:pPr>
+      <w:rPr>
+        <w:rFonts w:ascii="Wingdings" w:hAnsi="Wingdings" w:hint="default"/>
+        <w:sz w:val="20"/>
+      </w:rPr>
+    </w:lvl>
+    <w:lvl w:ilvl="5" w:tentative="1">
+      <w:start w:val="1"/>
+      <w:numFmt w:val="bullet"/>
+      <w:lvlText w:val=""/>
+      <w:lvlJc w:val="left"/>
+      <w:pPr>
+        <w:tabs>
+          <w:tab w:val="num" w:pos="4320"/>
+        </w:tabs>
+        <w:ind w:left="4320" w:hanging="360"/>
+      </w:pPr>
+      <w:rPr>
+        <w:rFonts w:ascii="Wingdings" w:hAnsi="Wingdings" w:hint="default"/>
+        <w:sz w:val="20"/>
+      </w:rPr>
+    </w:lvl>
+    <w:lvl w:ilvl="6" w:tentative="1">
+      <w:start w:val="1"/>
+      <w:numFmt w:val="bullet"/>
+      <w:lvlText w:val=""/>
+      <w:lvlJc w:val="left"/>
+      <w:pPr>
+        <w:tabs>
+          <w:tab w:val="num" w:pos="5040"/>
+        </w:tabs>
+        <w:ind w:left="5040" w:hanging="360"/>
+      </w:pPr>
+      <w:rPr>
+        <w:rFonts w:ascii="Wingdings" w:hAnsi="Wingdings" w:hint="default"/>
+        <w:sz w:val="20"/>
+      </w:rPr>
+    </w:lvl>
+    <w:lvl w:ilvl="7" w:tentative="1">
+      <w:start w:val="1"/>
+      <w:numFmt w:val="bullet"/>
+      <w:lvlText w:val=""/>
+      <w:lvlJc w:val="left"/>
+      <w:pPr>
+        <w:tabs>
+          <w:tab w:val="num" w:pos="5760"/>
+        </w:tabs>
+        <w:ind w:left="5760" w:hanging="360"/>
+      </w:pPr>
+      <w:rPr>
+        <w:rFonts w:ascii="Wingdings" w:hAnsi="Wingdings" w:hint="default"/>
+        <w:sz w:val="20"/>
+      </w:rPr>
+    </w:lvl>
+    <w:lvl w:ilvl="8" w:tentative="1">
+      <w:start w:val="1"/>
+      <w:numFmt w:val="bullet"/>
+      <w:lvlText w:val=""/>
+      <w:lvlJc w:val="left"/>
+      <w:pPr>
+        <w:tabs>
+          <w:tab w:val="num" w:pos="6480"/>
+        </w:tabs>
+        <w:ind w:left="6480" w:hanging="360"/>
+      </w:pPr>
+      <w:rPr>
+        <w:rFonts w:ascii="Wingdings" w:hAnsi="Wingdings" w:hint="default"/>
+        <w:sz w:val="20"/>
+      </w:rPr>
+    </w:lvl>
+  </w:abstractNum>
+  <w:abstractNum w:abstractNumId="10" w15:restartNumberingAfterBreak="0">
     <w:nsid w:val="6F8174CC"/>
     <w:multiLevelType w:val="hybridMultilevel"/>
     <w:tmpl w:val="45DEDB04"/>
@@ -1070,11 +2741,154 @@
       </w:rPr>
     </w:lvl>
   </w:abstractNum>
+  <w:abstractNum w:abstractNumId="11" w15:restartNumberingAfterBreak="0">
+    <w:nsid w:val="6FB67AD7"/>
+    <w:multiLevelType w:val="hybridMultilevel"/>
+    <w:tmpl w:val="9D4A9288"/>
+    <w:lvl w:ilvl="0" w:tplc="08130001">
+      <w:start w:val="1"/>
+      <w:numFmt w:val="bullet"/>
+      <w:lvlText w:val=""/>
+      <w:lvlJc w:val="left"/>
+      <w:pPr>
+        <w:ind w:left="720" w:hanging="360"/>
+      </w:pPr>
+      <w:rPr>
+        <w:rFonts w:ascii="Symbol" w:hAnsi="Symbol" w:hint="default"/>
+      </w:rPr>
+    </w:lvl>
+    <w:lvl w:ilvl="1" w:tplc="08130003">
+      <w:start w:val="1"/>
+      <w:numFmt w:val="bullet"/>
+      <w:lvlText w:val="o"/>
+      <w:lvlJc w:val="left"/>
+      <w:pPr>
+        <w:ind w:left="1440" w:hanging="360"/>
+      </w:pPr>
+      <w:rPr>
+        <w:rFonts w:ascii="Courier New" w:hAnsi="Courier New" w:cs="Courier New" w:hint="default"/>
+      </w:rPr>
+    </w:lvl>
+    <w:lvl w:ilvl="2" w:tplc="08130005">
+      <w:start w:val="1"/>
+      <w:numFmt w:val="bullet"/>
+      <w:lvlText w:val=""/>
+      <w:lvlJc w:val="left"/>
+      <w:pPr>
+        <w:ind w:left="2160" w:hanging="360"/>
+      </w:pPr>
+      <w:rPr>
+        <w:rFonts w:ascii="Wingdings" w:hAnsi="Wingdings" w:hint="default"/>
+      </w:rPr>
+    </w:lvl>
+    <w:lvl w:ilvl="3" w:tplc="08130001" w:tentative="1">
+      <w:start w:val="1"/>
+      <w:numFmt w:val="bullet"/>
+      <w:lvlText w:val=""/>
+      <w:lvlJc w:val="left"/>
+      <w:pPr>
+        <w:ind w:left="2880" w:hanging="360"/>
+      </w:pPr>
+      <w:rPr>
+        <w:rFonts w:ascii="Symbol" w:hAnsi="Symbol" w:hint="default"/>
+      </w:rPr>
+    </w:lvl>
+    <w:lvl w:ilvl="4" w:tplc="08130003" w:tentative="1">
+      <w:start w:val="1"/>
+      <w:numFmt w:val="bullet"/>
+      <w:lvlText w:val="o"/>
+      <w:lvlJc w:val="left"/>
+      <w:pPr>
+        <w:ind w:left="3600" w:hanging="360"/>
+      </w:pPr>
+      <w:rPr>
+        <w:rFonts w:ascii="Courier New" w:hAnsi="Courier New" w:cs="Courier New" w:hint="default"/>
+      </w:rPr>
+    </w:lvl>
+    <w:lvl w:ilvl="5" w:tplc="08130005" w:tentative="1">
+      <w:start w:val="1"/>
+      <w:numFmt w:val="bullet"/>
+      <w:lvlText w:val=""/>
+      <w:lvlJc w:val="left"/>
+      <w:pPr>
+        <w:ind w:left="4320" w:hanging="360"/>
+      </w:pPr>
+      <w:rPr>
+        <w:rFonts w:ascii="Wingdings" w:hAnsi="Wingdings" w:hint="default"/>
+      </w:rPr>
+    </w:lvl>
+    <w:lvl w:ilvl="6" w:tplc="08130001" w:tentative="1">
+      <w:start w:val="1"/>
+      <w:numFmt w:val="bullet"/>
+      <w:lvlText w:val=""/>
+      <w:lvlJc w:val="left"/>
+      <w:pPr>
+        <w:ind w:left="5040" w:hanging="360"/>
+      </w:pPr>
+      <w:rPr>
+        <w:rFonts w:ascii="Symbol" w:hAnsi="Symbol" w:hint="default"/>
+      </w:rPr>
+    </w:lvl>
+    <w:lvl w:ilvl="7" w:tplc="08130003" w:tentative="1">
+      <w:start w:val="1"/>
+      <w:numFmt w:val="bullet"/>
+      <w:lvlText w:val="o"/>
+      <w:lvlJc w:val="left"/>
+      <w:pPr>
+        <w:ind w:left="5760" w:hanging="360"/>
+      </w:pPr>
+      <w:rPr>
+        <w:rFonts w:ascii="Courier New" w:hAnsi="Courier New" w:cs="Courier New" w:hint="default"/>
+      </w:rPr>
+    </w:lvl>
+    <w:lvl w:ilvl="8" w:tplc="08130005" w:tentative="1">
+      <w:start w:val="1"/>
+      <w:numFmt w:val="bullet"/>
+      <w:lvlText w:val=""/>
+      <w:lvlJc w:val="left"/>
+      <w:pPr>
+        <w:ind w:left="6480" w:hanging="360"/>
+      </w:pPr>
+      <w:rPr>
+        <w:rFonts w:ascii="Wingdings" w:hAnsi="Wingdings" w:hint="default"/>
+      </w:rPr>
+    </w:lvl>
+  </w:abstractNum>
   <w:num w:numId="1" w16cid:durableId="1731490366">
+    <w:abstractNumId w:val="2"/>
+  </w:num>
+  <w:num w:numId="2" w16cid:durableId="176585325">
+    <w:abstractNumId w:val="10"/>
+  </w:num>
+  <w:num w:numId="3" w16cid:durableId="367220517">
+    <w:abstractNumId w:val="11"/>
+  </w:num>
+  <w:num w:numId="4" w16cid:durableId="339238294">
+    <w:abstractNumId w:val="1"/>
+  </w:num>
+  <w:num w:numId="5" w16cid:durableId="1001081102">
+    <w:abstractNumId w:val="7"/>
+  </w:num>
+  <w:num w:numId="6" w16cid:durableId="1243487218">
+    <w:abstractNumId w:val="6"/>
+  </w:num>
+  <w:num w:numId="7" w16cid:durableId="2049446037">
+    <w:abstractNumId w:val="9"/>
+  </w:num>
+  <w:num w:numId="8" w16cid:durableId="225537127">
     <w:abstractNumId w:val="0"/>
   </w:num>
-  <w:num w:numId="2" w16cid:durableId="176585325">
-    <w:abstractNumId w:val="1"/>
+  <w:num w:numId="9" w16cid:durableId="196428622">
+    <w:abstractNumId w:val="4"/>
+  </w:num>
+  <w:num w:numId="10" w16cid:durableId="816411473">
+    <w:abstractNumId w:val="5"/>
+  </w:num>
+  <w:num w:numId="11" w16cid:durableId="211118217">
+    <w:abstractNumId w:val="3"/>
+  </w:num>
+  <w:num w:numId="12" w16cid:durableId="1727027859">
+    <w:abstractNumId w:val="8"/>
   </w:num>
 </w:numbering>
 </file>
@@ -1681,7 +3495,6 @@
   <w:style w:type="character" w:default="1" w:styleId="DefaultParagraphFont">
     <w:name w:val="Default Paragraph Font"/>
     <w:uiPriority w:val="1"/>
-    <w:semiHidden/>
     <w:unhideWhenUsed/>
   </w:style>
   <w:style w:type="table" w:default="1" w:styleId="TableNormal">
@@ -1993,6 +3806,17 @@
       <w:smallCaps/>
       <w:color w:val="0F4761" w:themeColor="accent1" w:themeShade="BF"/>
       <w:spacing w:val="5"/>
+    </w:rPr>
+  </w:style>
+  <w:style w:type="character" w:styleId="Strong">
+    <w:name w:val="Strong"/>
+    <w:basedOn w:val="DefaultParagraphFont"/>
+    <w:uiPriority w:val="22"/>
+    <w:qFormat/>
+    <w:rsid w:val="002821EF"/>
+    <w:rPr>
+      <w:b/>
+      <w:bCs/>
     </w:rPr>
   </w:style>
 </w:styles>

</xml_diff>

<commit_message>
backlog / US aangepast
</commit_message>
<xml_diff>
--- a/user stories project.docx
+++ b/user stories project.docx
@@ -577,14 +577,16 @@
     </w:p>
     <w:p>
       <w:r>
-        <w:t>Als een user die de website bezoekt, wil ik de mogelijkheid hebben om de lijst op de homepage te sorteren, zodat ik de locaties kan zien in de volgorde dat ik wil.</w:t>
-      </w:r>
-    </w:p>
+        <w:t>Als een user die de website bezoekt, wil ik de verschillende locaties op alfabetisch volgorde gesorteerd zien, op basis van taal.</w:t>
+      </w:r>
+    </w:p>
+    <w:p/>
     <w:p>
       <w:r>
         <w:rPr>
           <w:u w:val="single"/>
         </w:rPr>
+        <w:lastRenderedPageBreak/>
         <w:t>Gherkin</w:t>
       </w:r>
       <w:r>
@@ -593,204 +595,192 @@
     </w:p>
     <w:p>
       <w:pPr>
+        <w:pStyle w:val="ListParagraph"/>
         <w:numPr>
           <w:ilvl w:val="0"/>
-          <w:numId w:val="6"/>
-        </w:numPr>
-        <w:spacing w:before="100" w:beforeAutospacing="1" w:after="100" w:afterAutospacing="1" w:line="240" w:lineRule="auto"/>
-        <w:rPr>
-          <w:rFonts w:eastAsia="Times New Roman" w:cs="Times New Roman"/>
-          <w:lang w:eastAsia="nl-BE"/>
-          <w14:ligatures w14:val="none"/>
-        </w:rPr>
-      </w:pPr>
-      <w:r>
-        <w:rPr>
-          <w:rFonts w:eastAsia="Times New Roman" w:cs="Times New Roman"/>
-          <w:lang w:eastAsia="nl-BE"/>
-          <w14:ligatures w14:val="none"/>
-        </w:rPr>
-        <w:lastRenderedPageBreak/>
-        <w:t>Given een user kiest een sorteermethode</w:t>
-      </w:r>
-    </w:p>
-    <w:p>
-      <w:pPr>
+          <w:numId w:val="13"/>
+        </w:numPr>
+      </w:pPr>
+      <w:r>
+        <w:t>Given een user opent de website</w:t>
+      </w:r>
+    </w:p>
+    <w:p>
+      <w:pPr>
+        <w:pStyle w:val="ListParagraph"/>
         <w:numPr>
           <w:ilvl w:val="1"/>
-          <w:numId w:val="6"/>
-        </w:numPr>
-        <w:spacing w:before="100" w:beforeAutospacing="1" w:after="100" w:afterAutospacing="1" w:line="240" w:lineRule="auto"/>
-        <w:rPr>
-          <w:rFonts w:eastAsia="Times New Roman" w:cs="Times New Roman"/>
-          <w:lang w:eastAsia="nl-BE"/>
-          <w14:ligatures w14:val="none"/>
-        </w:rPr>
-      </w:pPr>
-      <w:r>
-        <w:rPr>
-          <w:rFonts w:eastAsia="Times New Roman" w:cs="Times New Roman"/>
-          <w:lang w:eastAsia="nl-BE"/>
-          <w14:ligatures w14:val="none"/>
-        </w:rPr>
-        <w:t>When de sorteermethode geldig is voor de huidige lijst</w:t>
-      </w:r>
-    </w:p>
-    <w:p>
-      <w:pPr>
+          <w:numId w:val="13"/>
+        </w:numPr>
+      </w:pPr>
+      <w:r>
+        <w:t>When de lijst van locaties geladen is</w:t>
+      </w:r>
+    </w:p>
+    <w:p>
+      <w:pPr>
+        <w:pStyle w:val="ListParagraph"/>
         <w:numPr>
           <w:ilvl w:val="2"/>
-          <w:numId w:val="6"/>
-        </w:numPr>
-        <w:spacing w:before="100" w:beforeAutospacing="1" w:after="100" w:afterAutospacing="1" w:line="240" w:lineRule="auto"/>
-        <w:rPr>
-          <w:rFonts w:eastAsia="Times New Roman" w:cs="Times New Roman"/>
-          <w:lang w:eastAsia="nl-BE"/>
-          <w14:ligatures w14:val="none"/>
-        </w:rPr>
-      </w:pPr>
-      <w:r>
-        <w:rPr>
-          <w:rFonts w:eastAsia="Times New Roman" w:cs="Times New Roman"/>
-          <w:lang w:eastAsia="nl-BE"/>
-          <w14:ligatures w14:val="none"/>
-        </w:rPr>
-        <w:t xml:space="preserve">Then wordt de lijst aangepast en gesorteerd volgens de gekozen methode </w:t>
-      </w:r>
-    </w:p>
-    <w:p>
-      <w:pPr>
+          <w:numId w:val="13"/>
+        </w:numPr>
+      </w:pPr>
+      <w:r>
+        <w:t xml:space="preserve">Then wordt de lijst alfabetisch gesorteerd op basis van de huidige taal </w:t>
+      </w:r>
+    </w:p>
+    <w:p>
+      <w:pPr>
+        <w:pStyle w:val="ListParagraph"/>
         <w:numPr>
           <w:ilvl w:val="0"/>
-          <w:numId w:val="6"/>
-        </w:numPr>
-        <w:spacing w:before="100" w:beforeAutospacing="1" w:after="100" w:afterAutospacing="1" w:line="240" w:lineRule="auto"/>
-        <w:rPr>
-          <w:rFonts w:eastAsia="Times New Roman" w:cs="Times New Roman"/>
-          <w:lang w:eastAsia="nl-BE"/>
-          <w14:ligatures w14:val="none"/>
-        </w:rPr>
-      </w:pPr>
-      <w:r>
-        <w:rPr>
-          <w:rFonts w:eastAsia="Times New Roman" w:cs="Times New Roman"/>
-          <w:lang w:eastAsia="nl-BE"/>
-          <w14:ligatures w14:val="none"/>
-        </w:rPr>
-        <w:t>Given een user kiest een sorteermethode</w:t>
-      </w:r>
-    </w:p>
-    <w:p>
-      <w:pPr>
+          <w:numId w:val="13"/>
+        </w:numPr>
+      </w:pPr>
+      <w:r>
+        <w:t>Given een user verandert de taalvoorkeur</w:t>
+      </w:r>
+    </w:p>
+    <w:p>
+      <w:pPr>
+        <w:pStyle w:val="ListParagraph"/>
         <w:numPr>
           <w:ilvl w:val="1"/>
-          <w:numId w:val="6"/>
-        </w:numPr>
-        <w:spacing w:before="100" w:beforeAutospacing="1" w:after="100" w:afterAutospacing="1" w:line="240" w:lineRule="auto"/>
-        <w:rPr>
-          <w:rFonts w:eastAsia="Times New Roman" w:cs="Times New Roman"/>
-          <w:lang w:eastAsia="nl-BE"/>
-          <w14:ligatures w14:val="none"/>
-        </w:rPr>
-      </w:pPr>
-      <w:r>
-        <w:rPr>
-          <w:rFonts w:eastAsia="Times New Roman" w:cs="Times New Roman"/>
-          <w:lang w:eastAsia="nl-BE"/>
-          <w14:ligatures w14:val="none"/>
-        </w:rPr>
-        <w:t>When de sorteermethode niet kan worden toegepast</w:t>
-      </w:r>
-    </w:p>
-    <w:p>
-      <w:pPr>
+          <w:numId w:val="13"/>
+        </w:numPr>
+      </w:pPr>
+      <w:r>
+        <w:t>When de taal succesvol wordt aangepast</w:t>
+      </w:r>
+    </w:p>
+    <w:p>
+      <w:pPr>
+        <w:pStyle w:val="ListParagraph"/>
         <w:numPr>
           <w:ilvl w:val="2"/>
-          <w:numId w:val="6"/>
-        </w:numPr>
-        <w:spacing w:before="100" w:beforeAutospacing="1" w:after="100" w:afterAutospacing="1" w:line="240" w:lineRule="auto"/>
-        <w:rPr>
-          <w:rFonts w:eastAsia="Times New Roman" w:cs="Times New Roman"/>
-          <w:lang w:eastAsia="nl-BE"/>
-          <w14:ligatures w14:val="none"/>
-        </w:rPr>
-      </w:pPr>
-      <w:r>
-        <w:rPr>
-          <w:rFonts w:eastAsia="Times New Roman" w:cs="Times New Roman"/>
-          <w:lang w:eastAsia="nl-BE"/>
-          <w14:ligatures w14:val="none"/>
-        </w:rPr>
-        <w:t xml:space="preserve">Then wordt een foutmelding of waarschuwing getoond </w:t>
-      </w:r>
-    </w:p>
-    <w:p>
-      <w:pPr>
+          <w:numId w:val="13"/>
+        </w:numPr>
+      </w:pPr>
+      <w:r>
+        <w:t xml:space="preserve">Then wordt de lijst opnieuw alfabetisch gesorteerd volgens de gekozen taal </w:t>
+      </w:r>
+    </w:p>
+    <w:p>
+      <w:pPr>
+        <w:pStyle w:val="ListParagraph"/>
         <w:numPr>
           <w:ilvl w:val="0"/>
-          <w:numId w:val="6"/>
-        </w:numPr>
-        <w:spacing w:before="100" w:beforeAutospacing="1" w:after="100" w:afterAutospacing="1" w:line="240" w:lineRule="auto"/>
-        <w:rPr>
-          <w:rFonts w:eastAsia="Times New Roman" w:cs="Times New Roman"/>
-          <w:lang w:eastAsia="nl-BE"/>
-          <w14:ligatures w14:val="none"/>
-        </w:rPr>
-      </w:pPr>
-      <w:r>
-        <w:rPr>
-          <w:rFonts w:eastAsia="Times New Roman" w:cs="Times New Roman"/>
-          <w:lang w:eastAsia="nl-BE"/>
-          <w14:ligatures w14:val="none"/>
-        </w:rPr>
-        <w:t>Given een user heeft een sorteermethode gekozen</w:t>
-      </w:r>
-    </w:p>
-    <w:p>
-      <w:pPr>
+          <w:numId w:val="13"/>
+        </w:numPr>
+      </w:pPr>
+      <w:r>
+        <w:t>Given een user bekijkt de gesorteerde lijst</w:t>
+      </w:r>
+    </w:p>
+    <w:p>
+      <w:pPr>
+        <w:pStyle w:val="ListParagraph"/>
         <w:numPr>
           <w:ilvl w:val="1"/>
-          <w:numId w:val="6"/>
-        </w:numPr>
-        <w:spacing w:before="100" w:beforeAutospacing="1" w:after="100" w:afterAutospacing="1" w:line="240" w:lineRule="auto"/>
-        <w:rPr>
-          <w:rFonts w:eastAsia="Times New Roman" w:cs="Times New Roman"/>
-          <w:lang w:eastAsia="nl-BE"/>
-          <w14:ligatures w14:val="none"/>
-        </w:rPr>
-      </w:pPr>
-      <w:r>
-        <w:rPr>
-          <w:rFonts w:eastAsia="Times New Roman" w:cs="Times New Roman"/>
-          <w:lang w:eastAsia="nl-BE"/>
-          <w14:ligatures w14:val="none"/>
-        </w:rPr>
+          <w:numId w:val="13"/>
+        </w:numPr>
+      </w:pPr>
+      <w:r>
         <w:t>When de sortering toegepast is</w:t>
       </w:r>
     </w:p>
     <w:p>
       <w:pPr>
+        <w:pStyle w:val="ListParagraph"/>
         <w:numPr>
           <w:ilvl w:val="2"/>
-          <w:numId w:val="6"/>
-        </w:numPr>
-        <w:spacing w:before="100" w:beforeAutospacing="1" w:after="100" w:afterAutospacing="1" w:line="240" w:lineRule="auto"/>
-        <w:rPr>
-          <w:rFonts w:eastAsia="Times New Roman" w:cs="Times New Roman"/>
-          <w:lang w:eastAsia="nl-BE"/>
-          <w14:ligatures w14:val="none"/>
-        </w:rPr>
-      </w:pPr>
-      <w:r>
-        <w:rPr>
-          <w:rFonts w:eastAsia="Times New Roman" w:cs="Times New Roman"/>
-          <w:lang w:eastAsia="nl-BE"/>
-          <w14:ligatures w14:val="none"/>
-        </w:rPr>
-        <w:t xml:space="preserve">Then blijft de volledige lijst zichtbaar in de nieuwe volgorde </w:t>
-      </w:r>
-    </w:p>
-    <w:p/>
+          <w:numId w:val="13"/>
+        </w:numPr>
+      </w:pPr>
+      <w:r>
+        <w:t xml:space="preserve">Then blijven alle locaties zichtbaar in de juiste alfabetische volgorde </w:t>
+      </w:r>
+    </w:p>
+    <w:p>
+      <w:pPr>
+        <w:pStyle w:val="ListParagraph"/>
+        <w:numPr>
+          <w:ilvl w:val="0"/>
+          <w:numId w:val="13"/>
+        </w:numPr>
+      </w:pPr>
+      <w:r>
+        <w:t>Given een user bekijkt de lijst</w:t>
+      </w:r>
+    </w:p>
+    <w:p>
+      <w:pPr>
+        <w:pStyle w:val="ListParagraph"/>
+        <w:numPr>
+          <w:ilvl w:val="1"/>
+          <w:numId w:val="13"/>
+        </w:numPr>
+      </w:pPr>
+      <w:r>
+        <w:t>When de gekozen taal "nl" is</w:t>
+      </w:r>
+    </w:p>
+    <w:p>
+      <w:pPr>
+        <w:pStyle w:val="ListParagraph"/>
+        <w:numPr>
+          <w:ilvl w:val="2"/>
+          <w:numId w:val="13"/>
+        </w:numPr>
+      </w:pPr>
+      <w:r>
+        <w:t xml:space="preserve">Then wordt de sortering gebaseerd op de Nederlandse naam </w:t>
+      </w:r>
+    </w:p>
+    <w:p>
+      <w:pPr>
+        <w:pStyle w:val="ListParagraph"/>
+        <w:numPr>
+          <w:ilvl w:val="0"/>
+          <w:numId w:val="13"/>
+        </w:numPr>
+      </w:pPr>
+      <w:r>
+        <w:t>Given een user bekijkt de lijst</w:t>
+      </w:r>
+    </w:p>
+    <w:p>
+      <w:pPr>
+        <w:pStyle w:val="ListParagraph"/>
+        <w:numPr>
+          <w:ilvl w:val="1"/>
+          <w:numId w:val="13"/>
+        </w:numPr>
+      </w:pPr>
+      <w:r>
+        <w:t>When de gekozen taal "</w:t>
+      </w:r>
+      <w:proofErr w:type="spellStart"/>
+      <w:r>
+        <w:t>fr</w:t>
+      </w:r>
+      <w:proofErr w:type="spellEnd"/>
+      <w:r>
+        <w:t>" is</w:t>
+      </w:r>
+    </w:p>
+    <w:p>
+      <w:pPr>
+        <w:pStyle w:val="ListParagraph"/>
+        <w:numPr>
+          <w:ilvl w:val="2"/>
+          <w:numId w:val="13"/>
+        </w:numPr>
+      </w:pPr>
+      <w:r>
+        <w:t>Then wordt de sortering gebaseerd op de Franse naam</w:t>
+      </w:r>
+    </w:p>
     <w:p>
       <w:pPr>
         <w:rPr>
@@ -1217,13 +1207,9 @@
           <w:numId w:val="10"/>
         </w:numPr>
       </w:pPr>
-      <w:proofErr w:type="spellStart"/>
-      <w:r>
-        <w:t>Then</w:t>
-      </w:r>
-      <w:proofErr w:type="spellEnd"/>
-      <w:r>
-        <w:t xml:space="preserve"> past de </w:t>
+      <w:r>
+        <w:lastRenderedPageBreak/>
+        <w:t xml:space="preserve">Then past de </w:t>
       </w:r>
       <w:proofErr w:type="spellStart"/>
       <w:r>
@@ -1287,7 +1273,6 @@
         </w:numPr>
       </w:pPr>
       <w:r>
-        <w:lastRenderedPageBreak/>
         <w:t xml:space="preserve">Then ziet de user een duidelijke, gestructureerde en aantrekkelijke lay-out </w:t>
       </w:r>
     </w:p>
@@ -2252,6 +2237,119 @@
     </w:lvl>
   </w:abstractNum>
   <w:abstractNum w:abstractNumId="7" w15:restartNumberingAfterBreak="0">
+    <w:nsid w:val="5C2122E2"/>
+    <w:multiLevelType w:val="hybridMultilevel"/>
+    <w:tmpl w:val="EDC435F8"/>
+    <w:lvl w:ilvl="0" w:tplc="08130001">
+      <w:start w:val="1"/>
+      <w:numFmt w:val="bullet"/>
+      <w:lvlText w:val=""/>
+      <w:lvlJc w:val="left"/>
+      <w:pPr>
+        <w:ind w:left="720" w:hanging="360"/>
+      </w:pPr>
+      <w:rPr>
+        <w:rFonts w:ascii="Symbol" w:hAnsi="Symbol" w:hint="default"/>
+      </w:rPr>
+    </w:lvl>
+    <w:lvl w:ilvl="1" w:tplc="08130003">
+      <w:start w:val="1"/>
+      <w:numFmt w:val="bullet"/>
+      <w:lvlText w:val="o"/>
+      <w:lvlJc w:val="left"/>
+      <w:pPr>
+        <w:ind w:left="1440" w:hanging="360"/>
+      </w:pPr>
+      <w:rPr>
+        <w:rFonts w:ascii="Courier New" w:hAnsi="Courier New" w:cs="Courier New" w:hint="default"/>
+      </w:rPr>
+    </w:lvl>
+    <w:lvl w:ilvl="2" w:tplc="08130005">
+      <w:start w:val="1"/>
+      <w:numFmt w:val="bullet"/>
+      <w:lvlText w:val=""/>
+      <w:lvlJc w:val="left"/>
+      <w:pPr>
+        <w:ind w:left="2160" w:hanging="360"/>
+      </w:pPr>
+      <w:rPr>
+        <w:rFonts w:ascii="Wingdings" w:hAnsi="Wingdings" w:hint="default"/>
+      </w:rPr>
+    </w:lvl>
+    <w:lvl w:ilvl="3" w:tplc="08130001" w:tentative="1">
+      <w:start w:val="1"/>
+      <w:numFmt w:val="bullet"/>
+      <w:lvlText w:val=""/>
+      <w:lvlJc w:val="left"/>
+      <w:pPr>
+        <w:ind w:left="2880" w:hanging="360"/>
+      </w:pPr>
+      <w:rPr>
+        <w:rFonts w:ascii="Symbol" w:hAnsi="Symbol" w:hint="default"/>
+      </w:rPr>
+    </w:lvl>
+    <w:lvl w:ilvl="4" w:tplc="08130003" w:tentative="1">
+      <w:start w:val="1"/>
+      <w:numFmt w:val="bullet"/>
+      <w:lvlText w:val="o"/>
+      <w:lvlJc w:val="left"/>
+      <w:pPr>
+        <w:ind w:left="3600" w:hanging="360"/>
+      </w:pPr>
+      <w:rPr>
+        <w:rFonts w:ascii="Courier New" w:hAnsi="Courier New" w:cs="Courier New" w:hint="default"/>
+      </w:rPr>
+    </w:lvl>
+    <w:lvl w:ilvl="5" w:tplc="08130005" w:tentative="1">
+      <w:start w:val="1"/>
+      <w:numFmt w:val="bullet"/>
+      <w:lvlText w:val=""/>
+      <w:lvlJc w:val="left"/>
+      <w:pPr>
+        <w:ind w:left="4320" w:hanging="360"/>
+      </w:pPr>
+      <w:rPr>
+        <w:rFonts w:ascii="Wingdings" w:hAnsi="Wingdings" w:hint="default"/>
+      </w:rPr>
+    </w:lvl>
+    <w:lvl w:ilvl="6" w:tplc="08130001" w:tentative="1">
+      <w:start w:val="1"/>
+      <w:numFmt w:val="bullet"/>
+      <w:lvlText w:val=""/>
+      <w:lvlJc w:val="left"/>
+      <w:pPr>
+        <w:ind w:left="5040" w:hanging="360"/>
+      </w:pPr>
+      <w:rPr>
+        <w:rFonts w:ascii="Symbol" w:hAnsi="Symbol" w:hint="default"/>
+      </w:rPr>
+    </w:lvl>
+    <w:lvl w:ilvl="7" w:tplc="08130003" w:tentative="1">
+      <w:start w:val="1"/>
+      <w:numFmt w:val="bullet"/>
+      <w:lvlText w:val="o"/>
+      <w:lvlJc w:val="left"/>
+      <w:pPr>
+        <w:ind w:left="5760" w:hanging="360"/>
+      </w:pPr>
+      <w:rPr>
+        <w:rFonts w:ascii="Courier New" w:hAnsi="Courier New" w:cs="Courier New" w:hint="default"/>
+      </w:rPr>
+    </w:lvl>
+    <w:lvl w:ilvl="8" w:tplc="08130005" w:tentative="1">
+      <w:start w:val="1"/>
+      <w:numFmt w:val="bullet"/>
+      <w:lvlText w:val=""/>
+      <w:lvlJc w:val="left"/>
+      <w:pPr>
+        <w:ind w:left="6480" w:hanging="360"/>
+      </w:pPr>
+      <w:rPr>
+        <w:rFonts w:ascii="Wingdings" w:hAnsi="Wingdings" w:hint="default"/>
+      </w:rPr>
+    </w:lvl>
+  </w:abstractNum>
+  <w:abstractNum w:abstractNumId="8" w15:restartNumberingAfterBreak="0">
     <w:nsid w:val="5EDA1EF4"/>
     <w:multiLevelType w:val="hybridMultilevel"/>
     <w:tmpl w:val="77825B94"/>
@@ -2364,7 +2462,7 @@
       </w:rPr>
     </w:lvl>
   </w:abstractNum>
-  <w:abstractNum w:abstractNumId="8" w15:restartNumberingAfterBreak="0">
+  <w:abstractNum w:abstractNumId="9" w15:restartNumberingAfterBreak="0">
     <w:nsid w:val="67074711"/>
     <w:multiLevelType w:val="multilevel"/>
     <w:tmpl w:val="2BEED2C8"/>
@@ -2513,7 +2611,7 @@
       </w:rPr>
     </w:lvl>
   </w:abstractNum>
-  <w:abstractNum w:abstractNumId="9" w15:restartNumberingAfterBreak="0">
+  <w:abstractNum w:abstractNumId="10" w15:restartNumberingAfterBreak="0">
     <w:nsid w:val="6A1F6709"/>
     <w:multiLevelType w:val="multilevel"/>
     <w:tmpl w:val="254E8530"/>
@@ -2662,7 +2760,7 @@
       </w:rPr>
     </w:lvl>
   </w:abstractNum>
-  <w:abstractNum w:abstractNumId="10" w15:restartNumberingAfterBreak="0">
+  <w:abstractNum w:abstractNumId="11" w15:restartNumberingAfterBreak="0">
     <w:nsid w:val="6F8174CC"/>
     <w:multiLevelType w:val="hybridMultilevel"/>
     <w:tmpl w:val="45DEDB04"/>
@@ -2775,7 +2873,7 @@
       </w:rPr>
     </w:lvl>
   </w:abstractNum>
-  <w:abstractNum w:abstractNumId="11" w15:restartNumberingAfterBreak="0">
+  <w:abstractNum w:abstractNumId="12" w15:restartNumberingAfterBreak="0">
     <w:nsid w:val="6FB67AD7"/>
     <w:multiLevelType w:val="hybridMultilevel"/>
     <w:tmpl w:val="9D4A9288"/>
@@ -2892,22 +2990,22 @@
     <w:abstractNumId w:val="2"/>
   </w:num>
   <w:num w:numId="2" w16cid:durableId="176585325">
-    <w:abstractNumId w:val="10"/>
+    <w:abstractNumId w:val="11"/>
   </w:num>
   <w:num w:numId="3" w16cid:durableId="367220517">
-    <w:abstractNumId w:val="11"/>
+    <w:abstractNumId w:val="12"/>
   </w:num>
   <w:num w:numId="4" w16cid:durableId="339238294">
     <w:abstractNumId w:val="1"/>
   </w:num>
   <w:num w:numId="5" w16cid:durableId="1001081102">
-    <w:abstractNumId w:val="7"/>
+    <w:abstractNumId w:val="8"/>
   </w:num>
   <w:num w:numId="6" w16cid:durableId="1243487218">
     <w:abstractNumId w:val="6"/>
   </w:num>
   <w:num w:numId="7" w16cid:durableId="2049446037">
-    <w:abstractNumId w:val="9"/>
+    <w:abstractNumId w:val="10"/>
   </w:num>
   <w:num w:numId="8" w16cid:durableId="225537127">
     <w:abstractNumId w:val="0"/>
@@ -2922,7 +3020,10 @@
     <w:abstractNumId w:val="3"/>
   </w:num>
   <w:num w:numId="12" w16cid:durableId="1727027859">
-    <w:abstractNumId w:val="8"/>
+    <w:abstractNumId w:val="9"/>
+  </w:num>
+  <w:num w:numId="13" w16cid:durableId="2143234222">
+    <w:abstractNumId w:val="7"/>
   </w:num>
 </w:numbering>
 </file>
@@ -3529,7 +3630,6 @@
   <w:style w:type="character" w:default="1" w:styleId="DefaultParagraphFont">
     <w:name w:val="Default Paragraph Font"/>
     <w:uiPriority w:val="1"/>
-    <w:semiHidden/>
     <w:unhideWhenUsed/>
   </w:style>
   <w:style w:type="table" w:default="1" w:styleId="TableNormal">

</xml_diff>